<commit_message>
自动同步 DOCX — 2026-06-13 20:30
</commit_message>
<xml_diff>
--- a/计算机网络整体整理.docx
+++ b/计算机网络整体整理.docx
@@ -23346,6 +23346,7 @@
         <w:pStyle w:val="6"/>
         <w:widowControl/>
         <w:numPr>
+          <w:ilvl w:val="0"/>
           <w:numId w:val="0"/>
         </w:numPr>
         <w:shd w:val="clear" w:color="auto" w:fill="FFFFFF"/>
@@ -23456,6 +23457,7 @@
         <w:pStyle w:val="6"/>
         <w:widowControl/>
         <w:numPr>
+          <w:ilvl w:val="0"/>
           <w:numId w:val="0"/>
         </w:numPr>
         <w:shd w:val="clear" w:color="auto" w:fill="FFFFFF"/>
@@ -23571,6 +23573,7 @@
         <w:pStyle w:val="6"/>
         <w:widowControl/>
         <w:numPr>
+          <w:ilvl w:val="0"/>
           <w:numId w:val="0"/>
         </w:numPr>
         <w:shd w:val="clear" w:color="auto" w:fill="FFFFFF"/>
@@ -23686,6 +23689,7 @@
         <w:pStyle w:val="6"/>
         <w:widowControl/>
         <w:numPr>
+          <w:ilvl w:val="0"/>
           <w:numId w:val="0"/>
         </w:numPr>
         <w:shd w:val="clear" w:color="auto" w:fill="FFFFFF"/>
@@ -23819,6 +23823,7 @@
         <w:pStyle w:val="6"/>
         <w:widowControl/>
         <w:numPr>
+          <w:ilvl w:val="0"/>
           <w:numId w:val="0"/>
         </w:numPr>
         <w:shd w:val="clear" w:color="auto" w:fill="FFFFFF"/>
@@ -24328,6 +24333,7 @@
         <w:pStyle w:val="6"/>
         <w:widowControl/>
         <w:numPr>
+          <w:ilvl w:val="0"/>
           <w:numId w:val="0"/>
         </w:numPr>
         <w:shd w:val="clear" w:color="auto" w:fill="FFFFFF"/>
@@ -24557,6 +24563,7 @@
         <w:pStyle w:val="6"/>
         <w:widowControl/>
         <w:numPr>
+          <w:ilvl w:val="0"/>
           <w:numId w:val="0"/>
         </w:numPr>
         <w:shd w:val="clear" w:color="auto" w:fill="FFFFFF"/>
@@ -24672,6 +24679,7 @@
         <w:pStyle w:val="6"/>
         <w:widowControl/>
         <w:numPr>
+          <w:ilvl w:val="0"/>
           <w:numId w:val="0"/>
         </w:numPr>
         <w:shd w:val="clear" w:color="auto" w:fill="FFFFFF"/>
@@ -24745,6 +24753,7 @@
         <w:pStyle w:val="6"/>
         <w:widowControl/>
         <w:numPr>
+          <w:ilvl w:val="0"/>
           <w:numId w:val="0"/>
         </w:numPr>
         <w:shd w:val="clear" w:color="auto" w:fill="FFFFFF"/>
@@ -24977,6 +24986,7 @@
         <w:pStyle w:val="6"/>
         <w:widowControl/>
         <w:numPr>
+          <w:ilvl w:val="0"/>
           <w:numId w:val="0"/>
         </w:numPr>
         <w:shd w:val="clear" w:color="auto" w:fill="FFFFFF"/>
@@ -25115,6 +25125,7 @@
         <w:pStyle w:val="6"/>
         <w:widowControl/>
         <w:numPr>
+          <w:ilvl w:val="0"/>
           <w:numId w:val="0"/>
         </w:numPr>
         <w:shd w:val="clear" w:color="auto" w:fill="FFFFFF"/>
@@ -25227,6 +25238,7 @@
         <w:pStyle w:val="6"/>
         <w:widowControl/>
         <w:numPr>
+          <w:ilvl w:val="0"/>
           <w:numId w:val="0"/>
         </w:numPr>
         <w:shd w:val="clear" w:color="auto" w:fill="FFFFFF"/>
@@ -25446,6 +25458,7 @@
         <w:pStyle w:val="6"/>
         <w:widowControl/>
         <w:numPr>
+          <w:ilvl w:val="0"/>
           <w:numId w:val="0"/>
         </w:numPr>
         <w:shd w:val="clear" w:color="auto" w:fill="FFFFFF"/>
@@ -25610,6 +25623,7 @@
         <w:pStyle w:val="6"/>
         <w:widowControl/>
         <w:numPr>
+          <w:ilvl w:val="0"/>
           <w:numId w:val="0"/>
         </w:numPr>
         <w:shd w:val="clear" w:color="auto" w:fill="FFFFFF"/>
@@ -25761,6 +25775,7 @@
         <w:pStyle w:val="6"/>
         <w:widowControl/>
         <w:numPr>
+          <w:ilvl w:val="0"/>
           <w:numId w:val="0"/>
         </w:numPr>
         <w:shd w:val="clear" w:color="auto" w:fill="FFFFFF"/>
@@ -25832,6 +25847,7 @@
         <w:pStyle w:val="6"/>
         <w:widowControl/>
         <w:numPr>
+          <w:ilvl w:val="0"/>
           <w:numId w:val="0"/>
         </w:numPr>
         <w:shd w:val="clear" w:color="auto" w:fill="FFFFFF"/>
@@ -25905,6 +25921,7 @@
         <w:pStyle w:val="6"/>
         <w:widowControl/>
         <w:numPr>
+          <w:ilvl w:val="0"/>
           <w:numId w:val="0"/>
         </w:numPr>
         <w:shd w:val="clear" w:color="auto" w:fill="FFFFFF"/>
@@ -26082,6 +26099,7 @@
         <w:pStyle w:val="6"/>
         <w:widowControl/>
         <w:numPr>
+          <w:ilvl w:val="0"/>
           <w:numId w:val="0"/>
         </w:numPr>
         <w:shd w:val="clear" w:color="auto" w:fill="FFFFFF"/>
@@ -26153,6 +26171,7 @@
         <w:pStyle w:val="6"/>
         <w:widowControl/>
         <w:numPr>
+          <w:ilvl w:val="0"/>
           <w:numId w:val="0"/>
         </w:numPr>
         <w:shd w:val="clear" w:color="auto" w:fill="FFFFFF"/>
@@ -26239,6 +26258,7 @@
         <w:pStyle w:val="6"/>
         <w:widowControl/>
         <w:numPr>
+          <w:ilvl w:val="0"/>
           <w:numId w:val="0"/>
         </w:numPr>
         <w:shd w:val="clear" w:color="auto" w:fill="FFFFFF"/>
@@ -26273,6 +26293,7 @@
         <w:pStyle w:val="6"/>
         <w:widowControl/>
         <w:numPr>
+          <w:ilvl w:val="0"/>
           <w:numId w:val="0"/>
         </w:numPr>
         <w:shd w:val="clear" w:color="auto" w:fill="FFFFFF"/>
@@ -26462,6 +26483,7 @@
         <w:pStyle w:val="6"/>
         <w:widowControl/>
         <w:numPr>
+          <w:ilvl w:val="0"/>
           <w:numId w:val="0"/>
         </w:numPr>
         <w:shd w:val="clear" w:color="auto" w:fill="FFFFFF"/>
@@ -26496,6 +26518,7 @@
         <w:pStyle w:val="6"/>
         <w:widowControl/>
         <w:numPr>
+          <w:ilvl w:val="0"/>
           <w:numId w:val="0"/>
         </w:numPr>
         <w:shd w:val="clear" w:color="auto" w:fill="FFFFFF"/>
@@ -26582,6 +26605,7 @@
         <w:pStyle w:val="6"/>
         <w:widowControl/>
         <w:numPr>
+          <w:ilvl w:val="0"/>
           <w:numId w:val="0"/>
         </w:numPr>
         <w:shd w:val="clear" w:color="auto" w:fill="FFFFFF"/>
@@ -26681,6 +26705,7 @@
         <w:pStyle w:val="6"/>
         <w:widowControl/>
         <w:numPr>
+          <w:ilvl w:val="0"/>
           <w:numId w:val="0"/>
         </w:numPr>
         <w:shd w:val="clear" w:color="auto" w:fill="FFFFFF"/>
@@ -26780,6 +26805,7 @@
         <w:pStyle w:val="6"/>
         <w:widowControl/>
         <w:numPr>
+          <w:ilvl w:val="0"/>
           <w:numId w:val="0"/>
         </w:numPr>
         <w:shd w:val="clear" w:color="auto" w:fill="FFFFFF"/>
@@ -26827,6 +26853,7 @@
         <w:pStyle w:val="6"/>
         <w:widowControl/>
         <w:numPr>
+          <w:ilvl w:val="0"/>
           <w:numId w:val="0"/>
         </w:numPr>
         <w:shd w:val="clear" w:color="auto" w:fill="FFFFFF"/>
@@ -26900,6 +26927,7 @@
         <w:pStyle w:val="6"/>
         <w:widowControl/>
         <w:numPr>
+          <w:ilvl w:val="0"/>
           <w:numId w:val="0"/>
         </w:numPr>
         <w:shd w:val="clear" w:color="auto" w:fill="FFFFFF"/>
@@ -26921,6 +26949,7 @@
         <w:pStyle w:val="6"/>
         <w:widowControl/>
         <w:numPr>
+          <w:ilvl w:val="0"/>
           <w:numId w:val="0"/>
         </w:numPr>
         <w:shd w:val="clear" w:color="auto" w:fill="FFFFFF"/>
@@ -26955,6 +26984,7 @@
         <w:pStyle w:val="6"/>
         <w:widowControl/>
         <w:numPr>
+          <w:ilvl w:val="0"/>
           <w:numId w:val="0"/>
         </w:numPr>
         <w:shd w:val="clear" w:color="auto" w:fill="FFFFFF"/>
@@ -27028,6 +27058,7 @@
         <w:pStyle w:val="6"/>
         <w:widowControl/>
         <w:numPr>
+          <w:ilvl w:val="0"/>
           <w:numId w:val="0"/>
         </w:numPr>
         <w:shd w:val="clear" w:color="auto" w:fill="FFFFFF"/>
@@ -27075,6 +27106,7 @@
         <w:pStyle w:val="6"/>
         <w:widowControl/>
         <w:numPr>
+          <w:ilvl w:val="0"/>
           <w:numId w:val="0"/>
         </w:numPr>
         <w:shd w:val="clear" w:color="auto" w:fill="FFFFFF"/>
@@ -27122,6 +27154,7 @@
         <w:pStyle w:val="6"/>
         <w:widowControl/>
         <w:numPr>
+          <w:ilvl w:val="0"/>
           <w:numId w:val="0"/>
         </w:numPr>
         <w:shd w:val="clear" w:color="auto" w:fill="FFFFFF"/>
@@ -27193,6 +27226,7 @@
         <w:pStyle w:val="6"/>
         <w:widowControl/>
         <w:numPr>
+          <w:ilvl w:val="0"/>
           <w:numId w:val="0"/>
         </w:numPr>
         <w:shd w:val="clear" w:color="auto" w:fill="FFFFFF"/>
@@ -27266,6 +27300,7 @@
         <w:pStyle w:val="6"/>
         <w:widowControl/>
         <w:numPr>
+          <w:ilvl w:val="0"/>
           <w:numId w:val="0"/>
         </w:numPr>
         <w:shd w:val="clear" w:color="auto" w:fill="FFFFFF"/>
@@ -27339,6 +27374,7 @@
         <w:pStyle w:val="6"/>
         <w:widowControl/>
         <w:numPr>
+          <w:ilvl w:val="0"/>
           <w:numId w:val="0"/>
         </w:numPr>
         <w:shd w:val="clear" w:color="auto" w:fill="FFFFFF"/>
@@ -27529,6 +27565,7 @@
         <w:pStyle w:val="6"/>
         <w:widowControl/>
         <w:numPr>
+          <w:ilvl w:val="0"/>
           <w:numId w:val="0"/>
         </w:numPr>
         <w:shd w:val="clear" w:color="auto" w:fill="FFFFFF"/>
@@ -27600,6 +27637,7 @@
         <w:pStyle w:val="6"/>
         <w:widowControl/>
         <w:numPr>
+          <w:ilvl w:val="0"/>
           <w:numId w:val="0"/>
         </w:numPr>
         <w:shd w:val="clear" w:color="auto" w:fill="FFFFFF"/>
@@ -27634,6 +27672,7 @@
         <w:pStyle w:val="6"/>
         <w:widowControl/>
         <w:numPr>
+          <w:ilvl w:val="0"/>
           <w:numId w:val="0"/>
         </w:numPr>
         <w:shd w:val="clear" w:color="auto" w:fill="FFFFFF"/>
@@ -27668,6 +27707,7 @@
         <w:pStyle w:val="6"/>
         <w:widowControl/>
         <w:numPr>
+          <w:ilvl w:val="0"/>
           <w:numId w:val="0"/>
         </w:numPr>
         <w:shd w:val="clear" w:color="auto" w:fill="FFFFFF"/>
@@ -27702,6 +27742,7 @@
         <w:pStyle w:val="6"/>
         <w:widowControl/>
         <w:numPr>
+          <w:ilvl w:val="0"/>
           <w:numId w:val="0"/>
         </w:numPr>
         <w:shd w:val="clear" w:color="auto" w:fill="FFFFFF"/>
@@ -27773,6 +27814,7 @@
         <w:pStyle w:val="6"/>
         <w:widowControl/>
         <w:numPr>
+          <w:ilvl w:val="0"/>
           <w:numId w:val="0"/>
         </w:numPr>
         <w:shd w:val="clear" w:color="auto" w:fill="FFFFFF"/>
@@ -27807,6 +27849,7 @@
         <w:pStyle w:val="6"/>
         <w:widowControl/>
         <w:numPr>
+          <w:ilvl w:val="0"/>
           <w:numId w:val="0"/>
         </w:numPr>
         <w:shd w:val="clear" w:color="auto" w:fill="FFFFFF"/>
@@ -27878,6 +27921,7 @@
         <w:pStyle w:val="6"/>
         <w:widowControl/>
         <w:numPr>
+          <w:ilvl w:val="0"/>
           <w:numId w:val="0"/>
         </w:numPr>
         <w:shd w:val="clear" w:color="auto" w:fill="FFFFFF"/>
@@ -27977,6 +28021,7 @@
         <w:pStyle w:val="6"/>
         <w:widowControl/>
         <w:numPr>
+          <w:ilvl w:val="0"/>
           <w:numId w:val="0"/>
         </w:numPr>
         <w:shd w:val="clear" w:color="auto" w:fill="FFFFFF"/>
@@ -28167,6 +28212,7 @@
         <w:pStyle w:val="6"/>
         <w:widowControl/>
         <w:numPr>
+          <w:ilvl w:val="0"/>
           <w:numId w:val="0"/>
         </w:numPr>
         <w:shd w:val="clear" w:color="auto" w:fill="FFFFFF"/>
@@ -28227,6 +28273,7 @@
         <w:pStyle w:val="6"/>
         <w:widowControl/>
         <w:numPr>
+          <w:ilvl w:val="0"/>
           <w:numId w:val="0"/>
         </w:numPr>
         <w:shd w:val="clear" w:color="auto" w:fill="FFFFFF"/>
@@ -28298,6 +28345,7 @@
         <w:pStyle w:val="6"/>
         <w:widowControl/>
         <w:numPr>
+          <w:ilvl w:val="0"/>
           <w:numId w:val="0"/>
         </w:numPr>
         <w:shd w:val="clear" w:color="auto" w:fill="FFFFFF"/>
@@ -28332,6 +28380,7 @@
         <w:pStyle w:val="6"/>
         <w:widowControl/>
         <w:numPr>
+          <w:ilvl w:val="0"/>
           <w:numId w:val="0"/>
         </w:numPr>
         <w:shd w:val="clear" w:color="auto" w:fill="FFFFFF"/>
@@ -28403,6 +28452,7 @@
         <w:pStyle w:val="6"/>
         <w:widowControl/>
         <w:numPr>
+          <w:ilvl w:val="0"/>
           <w:numId w:val="0"/>
         </w:numPr>
         <w:shd w:val="clear" w:color="auto" w:fill="FFFFFF"/>
@@ -28437,6 +28487,7 @@
         <w:pStyle w:val="6"/>
         <w:widowControl/>
         <w:numPr>
+          <w:ilvl w:val="0"/>
           <w:numId w:val="0"/>
         </w:numPr>
         <w:shd w:val="clear" w:color="auto" w:fill="FFFFFF"/>
@@ -28471,6 +28522,7 @@
         <w:pStyle w:val="6"/>
         <w:widowControl/>
         <w:numPr>
+          <w:ilvl w:val="0"/>
           <w:numId w:val="0"/>
         </w:numPr>
         <w:shd w:val="clear" w:color="auto" w:fill="FFFFFF"/>
@@ -28505,6 +28557,7 @@
         <w:pStyle w:val="6"/>
         <w:widowControl/>
         <w:numPr>
+          <w:ilvl w:val="0"/>
           <w:numId w:val="0"/>
         </w:numPr>
         <w:shd w:val="clear" w:color="auto" w:fill="FFFFFF"/>
@@ -28539,6 +28592,7 @@
         <w:pStyle w:val="6"/>
         <w:widowControl/>
         <w:numPr>
+          <w:ilvl w:val="0"/>
           <w:numId w:val="0"/>
         </w:numPr>
         <w:shd w:val="clear" w:color="auto" w:fill="FFFFFF"/>
@@ -28610,6 +28664,7 @@
         <w:pStyle w:val="6"/>
         <w:widowControl/>
         <w:numPr>
+          <w:ilvl w:val="0"/>
           <w:numId w:val="0"/>
         </w:numPr>
         <w:shd w:val="clear" w:color="auto" w:fill="FFFFFF"/>
@@ -28670,6 +28725,7 @@
         <w:pStyle w:val="6"/>
         <w:widowControl/>
         <w:numPr>
+          <w:ilvl w:val="0"/>
           <w:numId w:val="0"/>
         </w:numPr>
         <w:shd w:val="clear" w:color="auto" w:fill="FFFFFF"/>
@@ -28743,6 +28799,7 @@
         <w:pStyle w:val="6"/>
         <w:widowControl/>
         <w:numPr>
+          <w:ilvl w:val="0"/>
           <w:numId w:val="0"/>
         </w:numPr>
         <w:shd w:val="clear" w:color="auto" w:fill="FFFFFF"/>
@@ -28777,6 +28834,7 @@
         <w:pStyle w:val="6"/>
         <w:widowControl/>
         <w:numPr>
+          <w:ilvl w:val="0"/>
           <w:numId w:val="0"/>
         </w:numPr>
         <w:shd w:val="clear" w:color="auto" w:fill="FFFFFF"/>
@@ -28876,6 +28934,7 @@
         <w:pStyle w:val="6"/>
         <w:widowControl/>
         <w:numPr>
+          <w:ilvl w:val="0"/>
           <w:numId w:val="0"/>
         </w:numPr>
         <w:shd w:val="clear" w:color="auto" w:fill="FFFFFF"/>
@@ -28949,6 +29008,7 @@
         <w:pStyle w:val="6"/>
         <w:widowControl/>
         <w:numPr>
+          <w:ilvl w:val="0"/>
           <w:numId w:val="0"/>
         </w:numPr>
         <w:shd w:val="clear" w:color="auto" w:fill="FFFFFF"/>
@@ -29022,6 +29082,7 @@
         <w:pStyle w:val="6"/>
         <w:widowControl/>
         <w:numPr>
+          <w:ilvl w:val="0"/>
           <w:numId w:val="0"/>
         </w:numPr>
         <w:shd w:val="clear" w:color="auto" w:fill="FFFFFF"/>
@@ -29095,6 +29156,7 @@
         <w:pStyle w:val="6"/>
         <w:widowControl/>
         <w:numPr>
+          <w:ilvl w:val="0"/>
           <w:numId w:val="0"/>
         </w:numPr>
         <w:shd w:val="clear" w:color="auto" w:fill="FFFFFF"/>
@@ -29228,6 +29290,7 @@
         <w:pStyle w:val="6"/>
         <w:widowControl/>
         <w:numPr>
+          <w:ilvl w:val="0"/>
           <w:numId w:val="0"/>
         </w:numPr>
         <w:shd w:val="clear" w:color="auto" w:fill="FFFFFF"/>
@@ -29312,6 +29375,7 @@
         <w:pStyle w:val="6"/>
         <w:widowControl/>
         <w:numPr>
+          <w:ilvl w:val="0"/>
           <w:numId w:val="0"/>
         </w:numPr>
         <w:shd w:val="clear" w:color="auto" w:fill="FFFFFF"/>
@@ -29445,6 +29509,7 @@
         <w:pStyle w:val="6"/>
         <w:widowControl/>
         <w:numPr>
+          <w:ilvl w:val="0"/>
           <w:numId w:val="0"/>
         </w:numPr>
         <w:shd w:val="clear" w:color="auto" w:fill="FFFFFF"/>
@@ -29617,6 +29682,7 @@
         <w:pStyle w:val="6"/>
         <w:widowControl/>
         <w:numPr>
+          <w:ilvl w:val="0"/>
           <w:numId w:val="0"/>
         </w:numPr>
         <w:shd w:val="clear" w:color="auto" w:fill="FFFFFF"/>
@@ -29750,6 +29816,7 @@
         <w:pStyle w:val="6"/>
         <w:widowControl/>
         <w:numPr>
+          <w:ilvl w:val="0"/>
           <w:numId w:val="0"/>
         </w:numPr>
         <w:shd w:val="clear" w:color="auto" w:fill="FFFFFF"/>
@@ -29821,6 +29888,7 @@
         <w:pStyle w:val="6"/>
         <w:widowControl/>
         <w:numPr>
+          <w:ilvl w:val="0"/>
           <w:numId w:val="0"/>
         </w:numPr>
         <w:shd w:val="clear" w:color="auto" w:fill="FFFFFF"/>
@@ -29892,6 +29960,7 @@
         <w:pStyle w:val="6"/>
         <w:widowControl/>
         <w:numPr>
+          <w:ilvl w:val="0"/>
           <w:numId w:val="0"/>
         </w:numPr>
         <w:shd w:val="clear" w:color="auto" w:fill="FFFFFF"/>
@@ -29989,6 +30058,7 @@
         <w:pStyle w:val="6"/>
         <w:widowControl/>
         <w:numPr>
+          <w:ilvl w:val="0"/>
           <w:numId w:val="0"/>
         </w:numPr>
         <w:shd w:val="clear" w:color="auto" w:fill="FFFFFF"/>
@@ -30106,6 +30176,7 @@
         <w:pStyle w:val="6"/>
         <w:widowControl/>
         <w:numPr>
+          <w:ilvl w:val="0"/>
           <w:numId w:val="0"/>
         </w:numPr>
         <w:shd w:val="clear" w:color="auto" w:fill="FFFFFF"/>
@@ -30426,6 +30497,7 @@
         <w:pStyle w:val="6"/>
         <w:widowControl/>
         <w:numPr>
+          <w:ilvl w:val="0"/>
           <w:numId w:val="0"/>
         </w:numPr>
         <w:shd w:val="clear" w:color="auto" w:fill="FFFFFF"/>
@@ -30452,6 +30524,7 @@
         <w:pStyle w:val="6"/>
         <w:widowControl/>
         <w:numPr>
+          <w:ilvl w:val="0"/>
           <w:numId w:val="0"/>
         </w:numPr>
         <w:shd w:val="clear" w:color="auto" w:fill="FFFFFF"/>
@@ -30505,6 +30578,7 @@
         <w:pStyle w:val="6"/>
         <w:widowControl/>
         <w:numPr>
+          <w:ilvl w:val="0"/>
           <w:numId w:val="0"/>
         </w:numPr>
         <w:shd w:val="clear" w:color="auto" w:fill="FFFFFF"/>
@@ -30542,6 +30616,7 @@
         <w:pStyle w:val="6"/>
         <w:widowControl/>
         <w:numPr>
+          <w:ilvl w:val="0"/>
           <w:numId w:val="0"/>
         </w:numPr>
         <w:shd w:val="clear" w:color="auto" w:fill="FFFFFF"/>
@@ -30579,6 +30654,7 @@
         <w:pStyle w:val="6"/>
         <w:widowControl/>
         <w:numPr>
+          <w:ilvl w:val="0"/>
           <w:numId w:val="0"/>
         </w:numPr>
         <w:shd w:val="clear" w:color="auto" w:fill="FFFFFF"/>
@@ -30616,6 +30692,7 @@
         <w:pStyle w:val="6"/>
         <w:widowControl/>
         <w:numPr>
+          <w:ilvl w:val="0"/>
           <w:numId w:val="0"/>
         </w:numPr>
         <w:shd w:val="clear" w:color="auto" w:fill="FFFFFF"/>
@@ -30671,6 +30748,7 @@
         <w:pStyle w:val="6"/>
         <w:widowControl/>
         <w:numPr>
+          <w:ilvl w:val="0"/>
           <w:numId w:val="0"/>
         </w:numPr>
         <w:shd w:val="clear" w:color="auto" w:fill="FFFFFF"/>
@@ -30720,6 +30798,7 @@
         <w:pStyle w:val="6"/>
         <w:widowControl/>
         <w:numPr>
+          <w:ilvl w:val="0"/>
           <w:numId w:val="0"/>
         </w:numPr>
         <w:shd w:val="clear" w:color="auto" w:fill="FFFFFF"/>
@@ -30781,6 +30860,7 @@
         <w:pStyle w:val="6"/>
         <w:widowControl/>
         <w:numPr>
+          <w:ilvl w:val="0"/>
           <w:numId w:val="0"/>
         </w:numPr>
         <w:shd w:val="clear" w:color="auto" w:fill="FFFFFF"/>
@@ -30875,32 +30955,13 @@
       </w:pPr>
       <w:r>
         <w:rPr>
-          <w:rFonts w:ascii="宋体" w:hAnsi="宋体" w:eastAsia="宋体" w:cs="宋体"/>
-          <w:b/>
-          <w:bCs/>
-          <w:sz w:val="24"/>
-          <w:szCs w:val="24"/>
-        </w:rPr>
-        <w:t>SDN网络和Internet在网络架构的主要区别。</w:t>
-      </w:r>
-    </w:p>
-    <w:p>
-      <w:pPr>
-        <w:widowControl/>
-        <w:numPr>
-          <w:numId w:val="0"/>
-        </w:numPr>
-        <w:shd w:val="clear" w:color="auto" w:fill="FFFFFF"/>
-        <w:ind w:right="-58" w:rightChars="0"/>
-        <w:jc w:val="both"/>
-        <w:rPr>
           <w:rFonts w:hint="eastAsia" w:ascii="inherit" w:hAnsi="inherit" w:eastAsia="宋体" w:cs="Helvetica"/>
           <w:b/>
           <w:bCs/>
           <w:color w:val="000000" w:themeColor="text1"/>
           <w:kern w:val="0"/>
-          <w:sz w:val="28"/>
-          <w:szCs w:val="28"/>
+          <w:sz w:val="24"/>
+          <w:szCs w:val="24"/>
           <w:lang w:val="en-US" w:eastAsia="zh-CN"/>
           <w14:textFill>
             <w14:solidFill>
@@ -30908,21 +30969,343 @@
             </w14:solidFill>
           </w14:textFill>
         </w:rPr>
-      </w:pPr>
-      <w:bookmarkStart w:id="1" w:name="_GoBack"/>
-      <w:bookmarkEnd w:id="1"/>
-    </w:p>
-    <w:p>
-      <w:pPr>
-        <w:pStyle w:val="6"/>
-        <w:widowControl/>
-        <w:numPr>
-          <w:numId w:val="0"/>
-        </w:numPr>
-        <w:shd w:val="clear" w:color="auto" w:fill="FFFFFF"/>
-        <w:ind w:right="-58" w:rightChars="0"/>
-        <w:rPr>
-          <w:rFonts w:hint="default" w:ascii="inherit" w:hAnsi="inherit" w:eastAsia="宋体" w:cs="Helvetica"/>
+        <w:t>传输层的功能</w:t>
+      </w:r>
+    </w:p>
+    <w:p>
+      <w:pPr>
+        <w:pStyle w:val="6"/>
+        <w:widowControl/>
+        <w:numPr>
+          <w:ilvl w:val="0"/>
+          <w:numId w:val="0"/>
+        </w:numPr>
+        <w:shd w:val="clear" w:color="auto" w:fill="FFFFFF"/>
+        <w:ind w:left="360" w:leftChars="0" w:right="-58" w:rightChars="0" w:firstLine="416" w:firstLineChars="0"/>
+        <w:rPr>
+          <w:rFonts w:hint="eastAsia" w:ascii="inherit" w:hAnsi="inherit" w:eastAsia="宋体" w:cs="Helvetica"/>
+          <w:b/>
+          <w:bCs/>
+          <w:color w:val="0000FF"/>
+          <w:kern w:val="0"/>
+          <w:sz w:val="24"/>
+          <w:szCs w:val="24"/>
+          <w:lang w:val="en-US" w:eastAsia="zh-CN"/>
+        </w:rPr>
+      </w:pPr>
+      <w:r>
+        <w:rPr>
+          <w:rFonts w:hint="eastAsia" w:ascii="inherit" w:hAnsi="inherit" w:eastAsia="宋体" w:cs="Helvetica"/>
+          <w:b/>
+          <w:bCs/>
+          <w:color w:val="0000FF"/>
+          <w:kern w:val="0"/>
+          <w:sz w:val="24"/>
+          <w:szCs w:val="24"/>
+          <w:lang w:val="en-US" w:eastAsia="zh-CN"/>
+        </w:rPr>
+        <w:t>消除网络层的不可靠服务</w:t>
+      </w:r>
+    </w:p>
+    <w:p>
+      <w:pPr>
+        <w:pStyle w:val="6"/>
+        <w:widowControl/>
+        <w:numPr>
+          <w:ilvl w:val="0"/>
+          <w:numId w:val="0"/>
+        </w:numPr>
+        <w:shd w:val="clear" w:color="auto" w:fill="FFFFFF"/>
+        <w:ind w:left="360" w:leftChars="0" w:right="-58" w:rightChars="0" w:firstLine="416" w:firstLineChars="0"/>
+        <w:rPr>
+          <w:rFonts w:hint="eastAsia" w:ascii="inherit" w:hAnsi="inherit" w:eastAsia="宋体" w:cs="Helvetica"/>
+          <w:b w:val="0"/>
+          <w:bCs w:val="0"/>
+          <w:color w:val="0000FF"/>
+          <w:kern w:val="0"/>
+          <w:sz w:val="24"/>
+          <w:szCs w:val="24"/>
+          <w:lang w:val="en-US" w:eastAsia="zh-CN"/>
+        </w:rPr>
+      </w:pPr>
+      <w:r>
+        <w:rPr>
+          <w:rFonts w:hint="eastAsia" w:ascii="inherit" w:hAnsi="inherit" w:eastAsia="宋体" w:cs="Helvetica"/>
+          <w:b w:val="0"/>
+          <w:bCs w:val="0"/>
+          <w:color w:val="0000FF"/>
+          <w:kern w:val="0"/>
+          <w:sz w:val="24"/>
+          <w:szCs w:val="24"/>
+          <w:lang w:val="en-US" w:eastAsia="zh-CN"/>
+        </w:rPr>
+        <w:t>提供从</w:t>
+      </w:r>
+      <w:r>
+        <w:rPr>
+          <w:rFonts w:hint="eastAsia" w:ascii="inherit" w:hAnsi="inherit" w:eastAsia="宋体" w:cs="Helvetica"/>
+          <w:b/>
+          <w:bCs/>
+          <w:color w:val="0000FF"/>
+          <w:kern w:val="0"/>
+          <w:sz w:val="24"/>
+          <w:szCs w:val="24"/>
+          <w:lang w:val="en-US" w:eastAsia="zh-CN"/>
+        </w:rPr>
+        <w:t>源主机到目的主机</w:t>
+      </w:r>
+      <w:r>
+        <w:rPr>
+          <w:rFonts w:hint="eastAsia" w:ascii="inherit" w:hAnsi="inherit" w:eastAsia="宋体" w:cs="Helvetica"/>
+          <w:b w:val="0"/>
+          <w:bCs w:val="0"/>
+          <w:color w:val="0000FF"/>
+          <w:kern w:val="0"/>
+          <w:sz w:val="24"/>
+          <w:szCs w:val="24"/>
+          <w:lang w:val="en-US" w:eastAsia="zh-CN"/>
+        </w:rPr>
+        <w:t>的</w:t>
+      </w:r>
+      <w:r>
+        <w:rPr>
+          <w:rFonts w:hint="eastAsia" w:ascii="inherit" w:hAnsi="inherit" w:eastAsia="宋体" w:cs="Helvetica"/>
+          <w:b/>
+          <w:bCs/>
+          <w:color w:val="0000FF"/>
+          <w:kern w:val="0"/>
+          <w:sz w:val="24"/>
+          <w:szCs w:val="24"/>
+          <w:lang w:val="en-US" w:eastAsia="zh-CN"/>
+        </w:rPr>
+        <w:t>可靠的</w:t>
+      </w:r>
+      <w:r>
+        <w:rPr>
+          <w:rFonts w:hint="eastAsia" w:ascii="inherit" w:hAnsi="inherit" w:eastAsia="宋体" w:cs="Helvetica"/>
+          <w:b w:val="0"/>
+          <w:bCs w:val="0"/>
+          <w:color w:val="0000FF"/>
+          <w:kern w:val="0"/>
+          <w:sz w:val="24"/>
+          <w:szCs w:val="24"/>
+          <w:lang w:val="en-US" w:eastAsia="zh-CN"/>
+        </w:rPr>
+        <w:t>、</w:t>
+      </w:r>
+      <w:r>
+        <w:rPr>
+          <w:rFonts w:hint="eastAsia" w:ascii="inherit" w:hAnsi="inherit" w:eastAsia="宋体" w:cs="Helvetica"/>
+          <w:b/>
+          <w:bCs/>
+          <w:color w:val="0000FF"/>
+          <w:kern w:val="0"/>
+          <w:sz w:val="24"/>
+          <w:szCs w:val="24"/>
+          <w:lang w:val="en-US" w:eastAsia="zh-CN"/>
+        </w:rPr>
+        <w:t>与实际使用的网络无关</w:t>
+      </w:r>
+      <w:r>
+        <w:rPr>
+          <w:rFonts w:hint="eastAsia" w:ascii="inherit" w:hAnsi="inherit" w:eastAsia="宋体" w:cs="Helvetica"/>
+          <w:b w:val="0"/>
+          <w:bCs w:val="0"/>
+          <w:color w:val="0000FF"/>
+          <w:kern w:val="0"/>
+          <w:sz w:val="24"/>
+          <w:szCs w:val="24"/>
+          <w:lang w:val="en-US" w:eastAsia="zh-CN"/>
+        </w:rPr>
+        <w:t>的信息传输</w:t>
+      </w:r>
+    </w:p>
+    <w:p>
+      <w:pPr>
+        <w:pStyle w:val="6"/>
+        <w:widowControl/>
+        <w:numPr>
+          <w:ilvl w:val="0"/>
+          <w:numId w:val="0"/>
+        </w:numPr>
+        <w:shd w:val="clear" w:color="auto" w:fill="FFFFFF"/>
+        <w:ind w:left="360" w:leftChars="0" w:right="-58" w:rightChars="0" w:firstLine="416" w:firstLineChars="0"/>
+        <w:rPr>
+          <w:rFonts w:hint="eastAsia" w:ascii="inherit" w:hAnsi="inherit" w:eastAsia="宋体" w:cs="Helvetica"/>
+          <w:b w:val="0"/>
+          <w:bCs w:val="0"/>
+          <w:color w:val="0000FF"/>
+          <w:kern w:val="0"/>
+          <w:sz w:val="24"/>
+          <w:szCs w:val="24"/>
+          <w:lang w:val="en-US" w:eastAsia="zh-CN"/>
+        </w:rPr>
+      </w:pPr>
+      <w:r>
+        <w:rPr>
+          <w:rFonts w:hint="eastAsia" w:ascii="inherit" w:hAnsi="inherit" w:eastAsia="宋体" w:cs="Helvetica"/>
+          <w:b/>
+          <w:bCs/>
+          <w:color w:val="0000FF"/>
+          <w:kern w:val="0"/>
+          <w:sz w:val="24"/>
+          <w:szCs w:val="24"/>
+          <w:lang w:val="en-US" w:eastAsia="zh-CN"/>
+        </w:rPr>
+        <w:t>传输层</w:t>
+      </w:r>
+      <w:r>
+        <w:rPr>
+          <w:rFonts w:hint="eastAsia" w:ascii="inherit" w:hAnsi="inherit" w:eastAsia="宋体" w:cs="Helvetica"/>
+          <w:b w:val="0"/>
+          <w:bCs w:val="0"/>
+          <w:color w:val="0000FF"/>
+          <w:kern w:val="0"/>
+          <w:sz w:val="24"/>
+          <w:szCs w:val="24"/>
+          <w:lang w:val="en-US" w:eastAsia="zh-CN"/>
+        </w:rPr>
+        <w:t>向上面的应用层提供信息服务，它属于</w:t>
+      </w:r>
+      <w:r>
+        <w:rPr>
+          <w:rFonts w:hint="eastAsia" w:ascii="inherit" w:hAnsi="inherit" w:eastAsia="宋体" w:cs="Helvetica"/>
+          <w:b/>
+          <w:bCs/>
+          <w:color w:val="0000FF"/>
+          <w:kern w:val="0"/>
+          <w:sz w:val="24"/>
+          <w:szCs w:val="24"/>
+          <w:lang w:val="en-US" w:eastAsia="zh-CN"/>
+        </w:rPr>
+        <w:t>面向通信部分的最高层</w:t>
+      </w:r>
+      <w:r>
+        <w:rPr>
+          <w:rFonts w:hint="eastAsia" w:ascii="inherit" w:hAnsi="inherit" w:eastAsia="宋体" w:cs="Helvetica"/>
+          <w:b w:val="0"/>
+          <w:bCs w:val="0"/>
+          <w:color w:val="0000FF"/>
+          <w:kern w:val="0"/>
+          <w:sz w:val="24"/>
+          <w:szCs w:val="24"/>
+          <w:lang w:val="en-US" w:eastAsia="zh-CN"/>
+        </w:rPr>
+        <w:t>，同时又是</w:t>
+      </w:r>
+      <w:r>
+        <w:rPr>
+          <w:rFonts w:hint="eastAsia" w:ascii="inherit" w:hAnsi="inherit" w:eastAsia="宋体" w:cs="Helvetica"/>
+          <w:b/>
+          <w:bCs/>
+          <w:color w:val="0000FF"/>
+          <w:kern w:val="0"/>
+          <w:sz w:val="24"/>
+          <w:szCs w:val="24"/>
+          <w:lang w:val="en-US" w:eastAsia="zh-CN"/>
+        </w:rPr>
+        <w:t>面向用户服务的最底层</w:t>
+      </w:r>
+      <w:r>
+        <w:rPr>
+          <w:rFonts w:hint="eastAsia" w:ascii="inherit" w:hAnsi="inherit" w:eastAsia="宋体" w:cs="Helvetica"/>
+          <w:b w:val="0"/>
+          <w:bCs w:val="0"/>
+          <w:color w:val="0000FF"/>
+          <w:kern w:val="0"/>
+          <w:sz w:val="24"/>
+          <w:szCs w:val="24"/>
+          <w:lang w:val="en-US" w:eastAsia="zh-CN"/>
+        </w:rPr>
+        <w:t>，传输层位于网络层与应用层之间</w:t>
+      </w:r>
+    </w:p>
+    <w:p>
+      <w:pPr>
+        <w:pStyle w:val="6"/>
+        <w:widowControl/>
+        <w:numPr>
+          <w:ilvl w:val="0"/>
+          <w:numId w:val="0"/>
+        </w:numPr>
+        <w:shd w:val="clear" w:color="auto" w:fill="FFFFFF"/>
+        <w:ind w:left="360" w:leftChars="0" w:right="-58" w:rightChars="0" w:firstLine="416" w:firstLineChars="0"/>
+        <w:rPr>
+          <w:rFonts w:hint="eastAsia" w:ascii="inherit" w:hAnsi="inherit" w:eastAsia="宋体" w:cs="Helvetica"/>
+          <w:b/>
+          <w:bCs/>
+          <w:color w:val="0000FF"/>
+          <w:kern w:val="0"/>
+          <w:sz w:val="24"/>
+          <w:szCs w:val="24"/>
+          <w:lang w:val="en-US" w:eastAsia="zh-CN"/>
+        </w:rPr>
+      </w:pPr>
+      <w:r>
+        <w:rPr>
+          <w:rFonts w:hint="eastAsia" w:ascii="inherit" w:hAnsi="inherit" w:eastAsia="宋体" w:cs="Helvetica"/>
+          <w:b w:val="0"/>
+          <w:bCs w:val="0"/>
+          <w:color w:val="0000FF"/>
+          <w:kern w:val="0"/>
+          <w:sz w:val="24"/>
+          <w:szCs w:val="24"/>
+          <w:lang w:val="en-US" w:eastAsia="zh-CN"/>
+        </w:rPr>
+        <w:t>传输层为运行在不同主机上的</w:t>
+      </w:r>
+      <w:r>
+        <w:rPr>
+          <w:rFonts w:hint="eastAsia" w:ascii="inherit" w:hAnsi="inherit" w:eastAsia="宋体" w:cs="Helvetica"/>
+          <w:b/>
+          <w:bCs/>
+          <w:color w:val="0000FF"/>
+          <w:kern w:val="0"/>
+          <w:sz w:val="24"/>
+          <w:szCs w:val="24"/>
+          <w:lang w:val="en-US" w:eastAsia="zh-CN"/>
+        </w:rPr>
+        <w:t>进程</w:t>
+      </w:r>
+      <w:r>
+        <w:rPr>
+          <w:rFonts w:hint="eastAsia" w:ascii="inherit" w:hAnsi="inherit" w:eastAsia="宋体" w:cs="Helvetica"/>
+          <w:b w:val="0"/>
+          <w:bCs w:val="0"/>
+          <w:color w:val="0000FF"/>
+          <w:kern w:val="0"/>
+          <w:sz w:val="24"/>
+          <w:szCs w:val="24"/>
+          <w:lang w:val="en-US" w:eastAsia="zh-CN"/>
+        </w:rPr>
+        <w:t>提供</w:t>
+      </w:r>
+      <w:r>
+        <w:rPr>
+          <w:rFonts w:hint="eastAsia" w:ascii="inherit" w:hAnsi="inherit" w:eastAsia="宋体" w:cs="Helvetica"/>
+          <w:b/>
+          <w:bCs/>
+          <w:color w:val="0000FF"/>
+          <w:kern w:val="0"/>
+          <w:sz w:val="24"/>
+          <w:szCs w:val="24"/>
+          <w:lang w:val="en-US" w:eastAsia="zh-CN"/>
+        </w:rPr>
+        <w:t>逻辑通信</w:t>
+      </w:r>
+    </w:p>
+    <w:p>
+      <w:pPr>
+        <w:pStyle w:val="6"/>
+        <w:widowControl/>
+        <w:numPr>
+          <w:ilvl w:val="0"/>
+          <w:numId w:val="0"/>
+        </w:numPr>
+        <w:shd w:val="clear" w:color="auto" w:fill="FFFFFF"/>
+        <w:ind w:left="360" w:leftChars="0" w:right="-58" w:rightChars="0" w:firstLine="416" w:firstLineChars="0"/>
+        <w:rPr>
+          <w:rFonts w:hint="eastAsia" w:ascii="inherit" w:hAnsi="inherit" w:eastAsia="宋体" w:cs="Helvetica"/>
           <w:b/>
           <w:bCs/>
           <w:color w:val="000000" w:themeColor="text1"/>
@@ -30935,6 +31318,2460 @@
               <w14:schemeClr w14:val="tx1"/>
             </w14:solidFill>
           </w14:textFill>
+        </w:rPr>
+      </w:pPr>
+    </w:p>
+    <w:p>
+      <w:pPr>
+        <w:pStyle w:val="6"/>
+        <w:widowControl/>
+        <w:numPr>
+          <w:ilvl w:val="0"/>
+          <w:numId w:val="1"/>
+        </w:numPr>
+        <w:shd w:val="clear" w:color="auto" w:fill="FFFFFF"/>
+        <w:ind w:right="-58" w:firstLineChars="0"/>
+        <w:rPr>
+          <w:rFonts w:hint="default" w:ascii="inherit" w:hAnsi="inherit" w:eastAsia="宋体" w:cs="Helvetica"/>
+          <w:b/>
+          <w:bCs/>
+          <w:color w:val="000000" w:themeColor="text1"/>
+          <w:kern w:val="0"/>
+          <w:sz w:val="24"/>
+          <w:szCs w:val="24"/>
+          <w:lang w:val="en-US" w:eastAsia="zh-CN"/>
+          <w14:textFill>
+            <w14:solidFill>
+              <w14:schemeClr w14:val="tx1"/>
+            </w14:solidFill>
+          </w14:textFill>
+        </w:rPr>
+      </w:pPr>
+      <w:r>
+        <w:rPr>
+          <w:rFonts w:hint="eastAsia" w:ascii="inherit" w:hAnsi="inherit" w:eastAsia="宋体" w:cs="Helvetica"/>
+          <w:b/>
+          <w:bCs/>
+          <w:color w:val="000000" w:themeColor="text1"/>
+          <w:kern w:val="0"/>
+          <w:sz w:val="24"/>
+          <w:szCs w:val="24"/>
+          <w:lang w:val="en-US" w:eastAsia="zh-CN"/>
+          <w14:textFill>
+            <w14:solidFill>
+              <w14:schemeClr w14:val="tx1"/>
+            </w14:solidFill>
+          </w14:textFill>
+        </w:rPr>
+        <w:t>※※※套接字Socket</w:t>
+      </w:r>
+    </w:p>
+    <w:p>
+      <w:pPr>
+        <w:pStyle w:val="6"/>
+        <w:widowControl/>
+        <w:numPr>
+          <w:ilvl w:val="0"/>
+          <w:numId w:val="0"/>
+        </w:numPr>
+        <w:shd w:val="clear" w:color="auto" w:fill="FFFFFF"/>
+        <w:ind w:left="360" w:leftChars="0" w:right="-58" w:rightChars="0" w:firstLine="416" w:firstLineChars="0"/>
+        <w:rPr>
+          <w:rFonts w:hint="eastAsia" w:ascii="inherit" w:hAnsi="inherit" w:eastAsia="宋体" w:cs="Helvetica"/>
+          <w:b w:val="0"/>
+          <w:bCs w:val="0"/>
+          <w:color w:val="0000FF"/>
+          <w:kern w:val="0"/>
+          <w:sz w:val="24"/>
+          <w:szCs w:val="24"/>
+          <w:lang w:val="en-US" w:eastAsia="zh-CN"/>
+        </w:rPr>
+      </w:pPr>
+      <w:r>
+        <w:rPr>
+          <w:rFonts w:hint="eastAsia" w:ascii="inherit" w:hAnsi="inherit" w:eastAsia="宋体" w:cs="Helvetica"/>
+          <w:b/>
+          <w:bCs/>
+          <w:color w:val="0000FF"/>
+          <w:kern w:val="0"/>
+          <w:sz w:val="24"/>
+          <w:szCs w:val="24"/>
+          <w:lang w:val="en-US" w:eastAsia="zh-CN"/>
+        </w:rPr>
+        <w:t>流式套接字：</w:t>
+      </w:r>
+      <w:r>
+        <w:rPr>
+          <w:rFonts w:hint="eastAsia" w:ascii="inherit" w:hAnsi="inherit" w:eastAsia="宋体" w:cs="Helvetica"/>
+          <w:b w:val="0"/>
+          <w:bCs w:val="0"/>
+          <w:color w:val="0000FF"/>
+          <w:kern w:val="0"/>
+          <w:sz w:val="24"/>
+          <w:szCs w:val="24"/>
+          <w:lang w:val="en-US" w:eastAsia="zh-CN"/>
+        </w:rPr>
+        <w:t>提供一种</w:t>
+      </w:r>
+      <w:r>
+        <w:rPr>
+          <w:rFonts w:hint="eastAsia" w:ascii="inherit" w:hAnsi="inherit" w:eastAsia="宋体" w:cs="Helvetica"/>
+          <w:b/>
+          <w:bCs/>
+          <w:color w:val="0000FF"/>
+          <w:kern w:val="0"/>
+          <w:sz w:val="24"/>
+          <w:szCs w:val="24"/>
+          <w:lang w:val="en-US" w:eastAsia="zh-CN"/>
+        </w:rPr>
+        <w:t>面向连接</w:t>
+      </w:r>
+      <w:r>
+        <w:rPr>
+          <w:rFonts w:hint="eastAsia" w:ascii="inherit" w:hAnsi="inherit" w:eastAsia="宋体" w:cs="Helvetica"/>
+          <w:b w:val="0"/>
+          <w:bCs w:val="0"/>
+          <w:color w:val="0000FF"/>
+          <w:kern w:val="0"/>
+          <w:sz w:val="24"/>
+          <w:szCs w:val="24"/>
+          <w:lang w:val="en-US" w:eastAsia="zh-CN"/>
+        </w:rPr>
+        <w:t>的、</w:t>
+      </w:r>
+      <w:r>
+        <w:rPr>
+          <w:rFonts w:hint="eastAsia" w:ascii="inherit" w:hAnsi="inherit" w:eastAsia="宋体" w:cs="Helvetica"/>
+          <w:b/>
+          <w:bCs/>
+          <w:color w:val="0000FF"/>
+          <w:kern w:val="0"/>
+          <w:sz w:val="24"/>
+          <w:szCs w:val="24"/>
+          <w:lang w:val="en-US" w:eastAsia="zh-CN"/>
+        </w:rPr>
+        <w:t>可靠的</w:t>
+      </w:r>
+      <w:r>
+        <w:rPr>
+          <w:rFonts w:hint="eastAsia" w:ascii="inherit" w:hAnsi="inherit" w:eastAsia="宋体" w:cs="Helvetica"/>
+          <w:b w:val="0"/>
+          <w:bCs w:val="0"/>
+          <w:color w:val="0000FF"/>
+          <w:kern w:val="0"/>
+          <w:sz w:val="24"/>
+          <w:szCs w:val="24"/>
+          <w:lang w:val="en-US" w:eastAsia="zh-CN"/>
+        </w:rPr>
+        <w:t>数据传输服务，数据</w:t>
+      </w:r>
+      <w:r>
+        <w:rPr>
+          <w:rFonts w:hint="eastAsia" w:ascii="inherit" w:hAnsi="inherit" w:eastAsia="宋体" w:cs="Helvetica"/>
+          <w:b/>
+          <w:bCs/>
+          <w:color w:val="0000FF"/>
+          <w:kern w:val="0"/>
+          <w:sz w:val="24"/>
+          <w:szCs w:val="24"/>
+          <w:lang w:val="en-US" w:eastAsia="zh-CN"/>
+        </w:rPr>
+        <w:t>无差错、无重复</w:t>
+      </w:r>
+      <w:r>
+        <w:rPr>
+          <w:rFonts w:hint="eastAsia" w:ascii="inherit" w:hAnsi="inherit" w:eastAsia="宋体" w:cs="Helvetica"/>
+          <w:b w:val="0"/>
+          <w:bCs w:val="0"/>
+          <w:color w:val="0000FF"/>
+          <w:kern w:val="0"/>
+          <w:sz w:val="24"/>
+          <w:szCs w:val="24"/>
+          <w:lang w:val="en-US" w:eastAsia="zh-CN"/>
+        </w:rPr>
+        <w:t>的发送，且按</w:t>
+      </w:r>
+      <w:r>
+        <w:rPr>
+          <w:rFonts w:hint="eastAsia" w:ascii="inherit" w:hAnsi="inherit" w:eastAsia="宋体" w:cs="Helvetica"/>
+          <w:b/>
+          <w:bCs/>
+          <w:color w:val="0000FF"/>
+          <w:kern w:val="0"/>
+          <w:sz w:val="24"/>
+          <w:szCs w:val="24"/>
+          <w:lang w:val="en-US" w:eastAsia="zh-CN"/>
+        </w:rPr>
+        <w:t>发送顺序</w:t>
+      </w:r>
+      <w:r>
+        <w:rPr>
+          <w:rFonts w:hint="eastAsia" w:ascii="inherit" w:hAnsi="inherit" w:eastAsia="宋体" w:cs="Helvetica"/>
+          <w:b w:val="0"/>
+          <w:bCs w:val="0"/>
+          <w:color w:val="0000FF"/>
+          <w:kern w:val="0"/>
+          <w:sz w:val="24"/>
+          <w:szCs w:val="24"/>
+          <w:lang w:val="en-US" w:eastAsia="zh-CN"/>
+        </w:rPr>
+        <w:t>接收。主要针对</w:t>
+      </w:r>
+      <w:r>
+        <w:rPr>
+          <w:rFonts w:hint="eastAsia" w:ascii="inherit" w:hAnsi="inherit" w:eastAsia="宋体" w:cs="Helvetica"/>
+          <w:b/>
+          <w:bCs/>
+          <w:color w:val="0000FF"/>
+          <w:kern w:val="0"/>
+          <w:sz w:val="24"/>
+          <w:szCs w:val="24"/>
+          <w:lang w:val="en-US" w:eastAsia="zh-CN"/>
+        </w:rPr>
+        <w:t>TCP协议（面向字节）</w:t>
+      </w:r>
+      <w:r>
+        <w:rPr>
+          <w:rFonts w:hint="eastAsia" w:ascii="inherit" w:hAnsi="inherit" w:eastAsia="宋体" w:cs="Helvetica"/>
+          <w:b w:val="0"/>
+          <w:bCs w:val="0"/>
+          <w:color w:val="0000FF"/>
+          <w:kern w:val="0"/>
+          <w:sz w:val="24"/>
+          <w:szCs w:val="24"/>
+          <w:lang w:val="en-US" w:eastAsia="zh-CN"/>
+        </w:rPr>
+        <w:t>设计</w:t>
+      </w:r>
+    </w:p>
+    <w:p>
+      <w:pPr>
+        <w:pStyle w:val="6"/>
+        <w:widowControl/>
+        <w:numPr>
+          <w:ilvl w:val="0"/>
+          <w:numId w:val="0"/>
+        </w:numPr>
+        <w:shd w:val="clear" w:color="auto" w:fill="FFFFFF"/>
+        <w:ind w:left="360" w:leftChars="0" w:right="-58" w:rightChars="0" w:firstLine="416" w:firstLineChars="0"/>
+        <w:rPr>
+          <w:rFonts w:hint="eastAsia" w:ascii="inherit" w:hAnsi="inherit" w:eastAsia="宋体" w:cs="Helvetica"/>
+          <w:b w:val="0"/>
+          <w:bCs w:val="0"/>
+          <w:color w:val="0000FF"/>
+          <w:kern w:val="0"/>
+          <w:sz w:val="24"/>
+          <w:szCs w:val="24"/>
+          <w:lang w:val="en-US" w:eastAsia="zh-CN"/>
+        </w:rPr>
+      </w:pPr>
+      <w:r>
+        <w:rPr>
+          <w:rFonts w:hint="eastAsia" w:ascii="inherit" w:hAnsi="inherit" w:eastAsia="宋体" w:cs="Helvetica"/>
+          <w:b/>
+          <w:bCs/>
+          <w:color w:val="0000FF"/>
+          <w:kern w:val="0"/>
+          <w:sz w:val="24"/>
+          <w:szCs w:val="24"/>
+          <w:lang w:val="en-US" w:eastAsia="zh-CN"/>
+        </w:rPr>
+        <w:t>数据报式套接字：</w:t>
+      </w:r>
+      <w:r>
+        <w:rPr>
+          <w:rFonts w:hint="eastAsia" w:ascii="inherit" w:hAnsi="inherit" w:eastAsia="宋体" w:cs="Helvetica"/>
+          <w:b w:val="0"/>
+          <w:bCs w:val="0"/>
+          <w:color w:val="0000FF"/>
+          <w:kern w:val="0"/>
+          <w:sz w:val="24"/>
+          <w:szCs w:val="24"/>
+          <w:lang w:val="en-US" w:eastAsia="zh-CN"/>
+        </w:rPr>
+        <w:t>提供一种</w:t>
+      </w:r>
+      <w:r>
+        <w:rPr>
+          <w:rFonts w:hint="eastAsia" w:ascii="inherit" w:hAnsi="inherit" w:eastAsia="宋体" w:cs="Helvetica"/>
+          <w:b/>
+          <w:bCs/>
+          <w:color w:val="0000FF"/>
+          <w:kern w:val="0"/>
+          <w:sz w:val="24"/>
+          <w:szCs w:val="24"/>
+          <w:lang w:val="en-US" w:eastAsia="zh-CN"/>
+        </w:rPr>
+        <w:t>无连接的</w:t>
+      </w:r>
+      <w:r>
+        <w:rPr>
+          <w:rFonts w:hint="eastAsia" w:ascii="inherit" w:hAnsi="inherit" w:eastAsia="宋体" w:cs="Helvetica"/>
+          <w:b w:val="0"/>
+          <w:bCs w:val="0"/>
+          <w:color w:val="0000FF"/>
+          <w:kern w:val="0"/>
+          <w:sz w:val="24"/>
+          <w:szCs w:val="24"/>
+          <w:lang w:val="en-US" w:eastAsia="zh-CN"/>
+        </w:rPr>
+        <w:t>、</w:t>
+      </w:r>
+      <w:r>
+        <w:rPr>
+          <w:rFonts w:hint="eastAsia" w:ascii="inherit" w:hAnsi="inherit" w:eastAsia="宋体" w:cs="Helvetica"/>
+          <w:b/>
+          <w:bCs/>
+          <w:color w:val="0000FF"/>
+          <w:kern w:val="0"/>
+          <w:sz w:val="24"/>
+          <w:szCs w:val="24"/>
+          <w:lang w:val="en-US" w:eastAsia="zh-CN"/>
+        </w:rPr>
+        <w:t>不可靠的</w:t>
+      </w:r>
+      <w:r>
+        <w:rPr>
+          <w:rFonts w:hint="eastAsia" w:ascii="inherit" w:hAnsi="inherit" w:eastAsia="宋体" w:cs="Helvetica"/>
+          <w:b w:val="0"/>
+          <w:bCs w:val="0"/>
+          <w:color w:val="0000FF"/>
+          <w:kern w:val="0"/>
+          <w:sz w:val="24"/>
+          <w:szCs w:val="24"/>
+          <w:lang w:val="en-US" w:eastAsia="zh-CN"/>
+        </w:rPr>
+        <w:t>数据传输服务。数据以</w:t>
+      </w:r>
+      <w:r>
+        <w:rPr>
+          <w:rFonts w:hint="eastAsia" w:ascii="inherit" w:hAnsi="inherit" w:eastAsia="宋体" w:cs="Helvetica"/>
+          <w:b/>
+          <w:bCs/>
+          <w:color w:val="0000FF"/>
+          <w:kern w:val="0"/>
+          <w:sz w:val="24"/>
+          <w:szCs w:val="24"/>
+          <w:lang w:val="en-US" w:eastAsia="zh-CN"/>
+        </w:rPr>
+        <w:t>独立包</w:t>
+      </w:r>
+      <w:r>
+        <w:rPr>
+          <w:rFonts w:hint="eastAsia" w:ascii="inherit" w:hAnsi="inherit" w:eastAsia="宋体" w:cs="Helvetica"/>
+          <w:b w:val="0"/>
+          <w:bCs w:val="0"/>
+          <w:color w:val="0000FF"/>
+          <w:kern w:val="0"/>
+          <w:sz w:val="24"/>
+          <w:szCs w:val="24"/>
+          <w:lang w:val="en-US" w:eastAsia="zh-CN"/>
+        </w:rPr>
+        <w:t>的形式被发送，提供一种</w:t>
+      </w:r>
+      <w:r>
+        <w:rPr>
+          <w:rFonts w:hint="eastAsia" w:ascii="inherit" w:hAnsi="inherit" w:eastAsia="宋体" w:cs="Helvetica"/>
+          <w:b/>
+          <w:bCs/>
+          <w:color w:val="0000FF"/>
+          <w:kern w:val="0"/>
+          <w:sz w:val="24"/>
+          <w:szCs w:val="24"/>
+          <w:lang w:val="en-US" w:eastAsia="zh-CN"/>
+        </w:rPr>
+        <w:t>尽力而为的交付服务</w:t>
+      </w:r>
+      <w:r>
+        <w:rPr>
+          <w:rFonts w:hint="eastAsia" w:ascii="inherit" w:hAnsi="inherit" w:eastAsia="宋体" w:cs="Helvetica"/>
+          <w:b w:val="0"/>
+          <w:bCs w:val="0"/>
+          <w:color w:val="0000FF"/>
+          <w:kern w:val="0"/>
+          <w:sz w:val="24"/>
+          <w:szCs w:val="24"/>
+          <w:lang w:val="en-US" w:eastAsia="zh-CN"/>
+        </w:rPr>
+        <w:t>，数据可能会</w:t>
+      </w:r>
+      <w:r>
+        <w:rPr>
+          <w:rFonts w:hint="eastAsia" w:ascii="inherit" w:hAnsi="inherit" w:eastAsia="宋体" w:cs="Helvetica"/>
+          <w:b/>
+          <w:bCs/>
+          <w:color w:val="0000FF"/>
+          <w:kern w:val="0"/>
+          <w:sz w:val="24"/>
+          <w:szCs w:val="24"/>
+          <w:lang w:val="en-US" w:eastAsia="zh-CN"/>
+        </w:rPr>
+        <w:t>出错</w:t>
+      </w:r>
+      <w:r>
+        <w:rPr>
+          <w:rFonts w:hint="eastAsia" w:ascii="inherit" w:hAnsi="inherit" w:eastAsia="宋体" w:cs="Helvetica"/>
+          <w:b w:val="0"/>
+          <w:bCs w:val="0"/>
+          <w:color w:val="0000FF"/>
+          <w:kern w:val="0"/>
+          <w:sz w:val="24"/>
+          <w:szCs w:val="24"/>
+          <w:lang w:val="en-US" w:eastAsia="zh-CN"/>
+        </w:rPr>
+        <w:t>、</w:t>
+      </w:r>
+      <w:r>
+        <w:rPr>
+          <w:rFonts w:hint="eastAsia" w:ascii="inherit" w:hAnsi="inherit" w:eastAsia="宋体" w:cs="Helvetica"/>
+          <w:b/>
+          <w:bCs/>
+          <w:color w:val="0000FF"/>
+          <w:kern w:val="0"/>
+          <w:sz w:val="24"/>
+          <w:szCs w:val="24"/>
+          <w:lang w:val="en-US" w:eastAsia="zh-CN"/>
+        </w:rPr>
+        <w:t>重复</w:t>
+      </w:r>
+      <w:r>
+        <w:rPr>
+          <w:rFonts w:hint="eastAsia" w:ascii="inherit" w:hAnsi="inherit" w:eastAsia="宋体" w:cs="Helvetica"/>
+          <w:b w:val="0"/>
+          <w:bCs w:val="0"/>
+          <w:color w:val="0000FF"/>
+          <w:kern w:val="0"/>
+          <w:sz w:val="24"/>
+          <w:szCs w:val="24"/>
+          <w:lang w:val="en-US" w:eastAsia="zh-CN"/>
+        </w:rPr>
+        <w:t>，并且</w:t>
+      </w:r>
+      <w:r>
+        <w:rPr>
+          <w:rFonts w:hint="eastAsia" w:ascii="inherit" w:hAnsi="inherit" w:eastAsia="宋体" w:cs="Helvetica"/>
+          <w:b/>
+          <w:bCs/>
+          <w:color w:val="0000FF"/>
+          <w:kern w:val="0"/>
+          <w:sz w:val="24"/>
+          <w:szCs w:val="24"/>
+          <w:lang w:val="en-US" w:eastAsia="zh-CN"/>
+        </w:rPr>
+        <w:t>接收顺序可能混乱</w:t>
+      </w:r>
+      <w:r>
+        <w:rPr>
+          <w:rFonts w:hint="eastAsia" w:ascii="inherit" w:hAnsi="inherit" w:eastAsia="宋体" w:cs="Helvetica"/>
+          <w:b w:val="0"/>
+          <w:bCs w:val="0"/>
+          <w:color w:val="0000FF"/>
+          <w:kern w:val="0"/>
+          <w:sz w:val="24"/>
+          <w:szCs w:val="24"/>
+          <w:lang w:val="en-US" w:eastAsia="zh-CN"/>
+        </w:rPr>
+        <w:t>。主要针对</w:t>
+      </w:r>
+      <w:r>
+        <w:rPr>
+          <w:rFonts w:hint="eastAsia" w:ascii="inherit" w:hAnsi="inherit" w:eastAsia="宋体" w:cs="Helvetica"/>
+          <w:b/>
+          <w:bCs/>
+          <w:color w:val="0000FF"/>
+          <w:kern w:val="0"/>
+          <w:sz w:val="24"/>
+          <w:szCs w:val="24"/>
+          <w:lang w:val="en-US" w:eastAsia="zh-CN"/>
+        </w:rPr>
+        <w:t>UDP协议</w:t>
+      </w:r>
+      <w:r>
+        <w:rPr>
+          <w:rFonts w:hint="eastAsia" w:ascii="inherit" w:hAnsi="inherit" w:eastAsia="宋体" w:cs="Helvetica"/>
+          <w:b w:val="0"/>
+          <w:bCs w:val="0"/>
+          <w:color w:val="0000FF"/>
+          <w:kern w:val="0"/>
+          <w:sz w:val="24"/>
+          <w:szCs w:val="24"/>
+          <w:lang w:val="en-US" w:eastAsia="zh-CN"/>
+        </w:rPr>
+        <w:t>设计</w:t>
+      </w:r>
+    </w:p>
+    <w:p>
+      <w:pPr>
+        <w:pStyle w:val="6"/>
+        <w:widowControl/>
+        <w:numPr>
+          <w:ilvl w:val="0"/>
+          <w:numId w:val="0"/>
+        </w:numPr>
+        <w:shd w:val="clear" w:color="auto" w:fill="FFFFFF"/>
+        <w:ind w:left="360" w:leftChars="0" w:right="-58" w:rightChars="0" w:firstLine="416" w:firstLineChars="0"/>
+        <w:rPr>
+          <w:rFonts w:hint="default" w:ascii="inherit" w:hAnsi="inherit" w:eastAsia="宋体" w:cs="Helvetica"/>
+          <w:b w:val="0"/>
+          <w:bCs w:val="0"/>
+          <w:color w:val="0000FF"/>
+          <w:kern w:val="0"/>
+          <w:sz w:val="24"/>
+          <w:szCs w:val="24"/>
+          <w:lang w:val="en-US" w:eastAsia="zh-CN"/>
+        </w:rPr>
+      </w:pPr>
+      <w:r>
+        <w:rPr>
+          <w:rFonts w:hint="eastAsia" w:ascii="inherit" w:hAnsi="inherit" w:eastAsia="宋体" w:cs="Helvetica"/>
+          <w:b/>
+          <w:bCs/>
+          <w:color w:val="0000FF"/>
+          <w:kern w:val="0"/>
+          <w:sz w:val="24"/>
+          <w:szCs w:val="24"/>
+          <w:lang w:val="en-US" w:eastAsia="zh-CN"/>
+        </w:rPr>
+        <w:t>原始式套接字：</w:t>
+      </w:r>
+      <w:r>
+        <w:rPr>
+          <w:rFonts w:hint="eastAsia" w:ascii="inherit" w:hAnsi="inherit" w:eastAsia="宋体" w:cs="Helvetica"/>
+          <w:b w:val="0"/>
+          <w:bCs w:val="0"/>
+          <w:color w:val="0000FF"/>
+          <w:kern w:val="0"/>
+          <w:sz w:val="24"/>
+          <w:szCs w:val="24"/>
+          <w:lang w:val="en-US" w:eastAsia="zh-CN"/>
+        </w:rPr>
+        <w:t>针对</w:t>
+      </w:r>
+      <w:r>
+        <w:rPr>
+          <w:rFonts w:hint="eastAsia" w:ascii="inherit" w:hAnsi="inherit" w:eastAsia="宋体" w:cs="Helvetica"/>
+          <w:b/>
+          <w:bCs/>
+          <w:color w:val="0000FF"/>
+          <w:kern w:val="0"/>
+          <w:sz w:val="24"/>
+          <w:szCs w:val="24"/>
+          <w:lang w:val="en-US" w:eastAsia="zh-CN"/>
+        </w:rPr>
+        <w:t>直接使用IP层服务的协议</w:t>
+      </w:r>
+      <w:r>
+        <w:rPr>
+          <w:rFonts w:hint="eastAsia" w:ascii="inherit" w:hAnsi="inherit" w:eastAsia="宋体" w:cs="Helvetica"/>
+          <w:b w:val="0"/>
+          <w:bCs w:val="0"/>
+          <w:color w:val="0000FF"/>
+          <w:kern w:val="0"/>
+          <w:sz w:val="24"/>
+          <w:szCs w:val="24"/>
+          <w:lang w:val="en-US" w:eastAsia="zh-CN"/>
+        </w:rPr>
+        <w:t>而设计，例如</w:t>
+      </w:r>
+      <w:r>
+        <w:rPr>
+          <w:rFonts w:hint="eastAsia" w:ascii="inherit" w:hAnsi="inherit" w:eastAsia="宋体" w:cs="Helvetica"/>
+          <w:b/>
+          <w:bCs/>
+          <w:color w:val="0000FF"/>
+          <w:kern w:val="0"/>
+          <w:sz w:val="24"/>
+          <w:szCs w:val="24"/>
+          <w:lang w:val="en-US" w:eastAsia="zh-CN"/>
+        </w:rPr>
+        <w:t>OSPF与ISMP</w:t>
+      </w:r>
+    </w:p>
+    <w:p>
+      <w:pPr>
+        <w:pStyle w:val="6"/>
+        <w:widowControl/>
+        <w:numPr>
+          <w:ilvl w:val="0"/>
+          <w:numId w:val="0"/>
+        </w:numPr>
+        <w:shd w:val="clear" w:color="auto" w:fill="FFFFFF"/>
+        <w:ind w:right="-58" w:rightChars="0"/>
+        <w:rPr>
+          <w:rFonts w:hint="default" w:ascii="inherit" w:hAnsi="inherit" w:eastAsia="宋体" w:cs="Helvetica"/>
+          <w:b/>
+          <w:bCs/>
+          <w:color w:val="000000" w:themeColor="text1"/>
+          <w:kern w:val="0"/>
+          <w:sz w:val="24"/>
+          <w:szCs w:val="24"/>
+          <w:lang w:val="en-US" w:eastAsia="zh-CN"/>
+          <w14:textFill>
+            <w14:solidFill>
+              <w14:schemeClr w14:val="tx1"/>
+            </w14:solidFill>
+          </w14:textFill>
+        </w:rPr>
+      </w:pPr>
+    </w:p>
+    <w:p>
+      <w:pPr>
+        <w:pStyle w:val="6"/>
+        <w:widowControl/>
+        <w:numPr>
+          <w:ilvl w:val="0"/>
+          <w:numId w:val="1"/>
+        </w:numPr>
+        <w:shd w:val="clear" w:color="auto" w:fill="FFFFFF"/>
+        <w:ind w:right="-58" w:firstLineChars="0"/>
+        <w:rPr>
+          <w:rFonts w:hint="default" w:ascii="inherit" w:hAnsi="inherit" w:eastAsia="宋体" w:cs="Helvetica"/>
+          <w:b/>
+          <w:bCs/>
+          <w:color w:val="000000" w:themeColor="text1"/>
+          <w:kern w:val="0"/>
+          <w:sz w:val="24"/>
+          <w:szCs w:val="24"/>
+          <w:lang w:val="en-US" w:eastAsia="zh-CN"/>
+          <w14:textFill>
+            <w14:solidFill>
+              <w14:schemeClr w14:val="tx1"/>
+            </w14:solidFill>
+          </w14:textFill>
+        </w:rPr>
+      </w:pPr>
+      <w:r>
+        <w:rPr>
+          <w:rFonts w:hint="eastAsia" w:ascii="inherit" w:hAnsi="inherit" w:eastAsia="宋体" w:cs="Helvetica"/>
+          <w:b/>
+          <w:bCs/>
+          <w:color w:val="000000" w:themeColor="text1"/>
+          <w:kern w:val="0"/>
+          <w:sz w:val="24"/>
+          <w:szCs w:val="24"/>
+          <w:lang w:val="en-US" w:eastAsia="zh-CN"/>
+          <w14:textFill>
+            <w14:solidFill>
+              <w14:schemeClr w14:val="tx1"/>
+            </w14:solidFill>
+          </w14:textFill>
+        </w:rPr>
+        <w:t>※※※拥塞控制与流量控制的区别</w:t>
+      </w:r>
+    </w:p>
+    <w:p>
+      <w:pPr>
+        <w:pStyle w:val="6"/>
+        <w:widowControl/>
+        <w:numPr>
+          <w:ilvl w:val="0"/>
+          <w:numId w:val="0"/>
+        </w:numPr>
+        <w:shd w:val="clear" w:color="auto" w:fill="FFFFFF"/>
+        <w:ind w:left="360" w:leftChars="0" w:right="-58" w:rightChars="0" w:firstLine="416" w:firstLineChars="0"/>
+        <w:rPr>
+          <w:rFonts w:hint="eastAsia" w:ascii="inherit" w:hAnsi="inherit" w:eastAsia="宋体" w:cs="Helvetica"/>
+          <w:b w:val="0"/>
+          <w:bCs w:val="0"/>
+          <w:color w:val="0000FF"/>
+          <w:kern w:val="0"/>
+          <w:sz w:val="24"/>
+          <w:szCs w:val="24"/>
+          <w:lang w:val="en-US" w:eastAsia="zh-CN"/>
+        </w:rPr>
+      </w:pPr>
+      <w:r>
+        <w:rPr>
+          <w:rFonts w:hint="eastAsia" w:ascii="inherit" w:hAnsi="inherit" w:eastAsia="宋体" w:cs="Helvetica"/>
+          <w:b/>
+          <w:bCs/>
+          <w:color w:val="0000FF"/>
+          <w:kern w:val="0"/>
+          <w:sz w:val="24"/>
+          <w:szCs w:val="24"/>
+          <w:lang w:val="en-US" w:eastAsia="zh-CN"/>
+        </w:rPr>
+        <w:t>拥塞控制：</w:t>
+      </w:r>
+      <w:r>
+        <w:rPr>
+          <w:rFonts w:hint="eastAsia" w:ascii="inherit" w:hAnsi="inherit" w:eastAsia="宋体" w:cs="Helvetica"/>
+          <w:b w:val="0"/>
+          <w:bCs w:val="0"/>
+          <w:color w:val="0000FF"/>
+          <w:kern w:val="0"/>
+          <w:sz w:val="24"/>
+          <w:szCs w:val="24"/>
+          <w:lang w:val="en-US" w:eastAsia="zh-CN"/>
+        </w:rPr>
+        <w:t>需要确保</w:t>
+      </w:r>
+      <w:r>
+        <w:rPr>
+          <w:rFonts w:hint="eastAsia" w:ascii="inherit" w:hAnsi="inherit" w:eastAsia="宋体" w:cs="Helvetica"/>
+          <w:b/>
+          <w:bCs/>
+          <w:color w:val="0000FF"/>
+          <w:kern w:val="0"/>
+          <w:sz w:val="24"/>
+          <w:szCs w:val="24"/>
+          <w:lang w:val="en-US" w:eastAsia="zh-CN"/>
+        </w:rPr>
+        <w:t>通信子网能够承载用户提供的数据量</w:t>
+      </w:r>
+      <w:r>
+        <w:rPr>
+          <w:rFonts w:hint="eastAsia" w:ascii="inherit" w:hAnsi="inherit" w:eastAsia="宋体" w:cs="Helvetica"/>
+          <w:b w:val="0"/>
+          <w:bCs w:val="0"/>
+          <w:color w:val="0000FF"/>
+          <w:kern w:val="0"/>
+          <w:sz w:val="24"/>
+          <w:szCs w:val="24"/>
+          <w:lang w:val="en-US" w:eastAsia="zh-CN"/>
+        </w:rPr>
+        <w:t>，是一个</w:t>
+      </w:r>
+      <w:r>
+        <w:rPr>
+          <w:rFonts w:hint="eastAsia" w:ascii="inherit" w:hAnsi="inherit" w:eastAsia="宋体" w:cs="Helvetica"/>
+          <w:b/>
+          <w:bCs/>
+          <w:color w:val="0000FF"/>
+          <w:kern w:val="0"/>
+          <w:sz w:val="24"/>
+          <w:szCs w:val="24"/>
+          <w:lang w:val="en-US" w:eastAsia="zh-CN"/>
+        </w:rPr>
+        <w:t>全局性的问题</w:t>
+      </w:r>
+      <w:r>
+        <w:rPr>
+          <w:rFonts w:hint="eastAsia" w:ascii="inherit" w:hAnsi="inherit" w:eastAsia="宋体" w:cs="Helvetica"/>
+          <w:b w:val="0"/>
+          <w:bCs w:val="0"/>
+          <w:color w:val="0000FF"/>
+          <w:kern w:val="0"/>
+          <w:sz w:val="24"/>
+          <w:szCs w:val="24"/>
+          <w:lang w:val="en-US" w:eastAsia="zh-CN"/>
+        </w:rPr>
+        <w:t>，涉及</w:t>
+      </w:r>
+      <w:r>
+        <w:rPr>
+          <w:rFonts w:hint="eastAsia" w:ascii="inherit" w:hAnsi="inherit" w:eastAsia="宋体" w:cs="Helvetica"/>
+          <w:b/>
+          <w:bCs/>
+          <w:color w:val="0000FF"/>
+          <w:kern w:val="0"/>
+          <w:sz w:val="24"/>
+          <w:szCs w:val="24"/>
+          <w:lang w:val="en-US" w:eastAsia="zh-CN"/>
+        </w:rPr>
+        <w:t>路由器</w:t>
+      </w:r>
+      <w:r>
+        <w:rPr>
+          <w:rFonts w:hint="eastAsia" w:ascii="inherit" w:hAnsi="inherit" w:eastAsia="宋体" w:cs="Helvetica"/>
+          <w:b w:val="0"/>
+          <w:bCs w:val="0"/>
+          <w:color w:val="0000FF"/>
+          <w:kern w:val="0"/>
+          <w:sz w:val="24"/>
+          <w:szCs w:val="24"/>
+          <w:lang w:val="en-US" w:eastAsia="zh-CN"/>
+        </w:rPr>
+        <w:t>与</w:t>
+      </w:r>
+      <w:r>
+        <w:rPr>
+          <w:rFonts w:hint="eastAsia" w:ascii="inherit" w:hAnsi="inherit" w:eastAsia="宋体" w:cs="Helvetica"/>
+          <w:b/>
+          <w:bCs/>
+          <w:color w:val="0000FF"/>
+          <w:kern w:val="0"/>
+          <w:sz w:val="24"/>
+          <w:szCs w:val="24"/>
+          <w:lang w:val="en-US" w:eastAsia="zh-CN"/>
+        </w:rPr>
+        <w:t>主机</w:t>
+      </w:r>
+      <w:r>
+        <w:rPr>
+          <w:rFonts w:hint="eastAsia" w:ascii="inherit" w:hAnsi="inherit" w:eastAsia="宋体" w:cs="Helvetica"/>
+          <w:b w:val="0"/>
+          <w:bCs w:val="0"/>
+          <w:color w:val="0000FF"/>
+          <w:kern w:val="0"/>
+          <w:sz w:val="24"/>
+          <w:szCs w:val="24"/>
+          <w:lang w:val="en-US" w:eastAsia="zh-CN"/>
+        </w:rPr>
+        <w:t>等多方面问题</w:t>
+      </w:r>
+    </w:p>
+    <w:p>
+      <w:pPr>
+        <w:pStyle w:val="6"/>
+        <w:widowControl/>
+        <w:numPr>
+          <w:ilvl w:val="0"/>
+          <w:numId w:val="0"/>
+        </w:numPr>
+        <w:shd w:val="clear" w:color="auto" w:fill="FFFFFF"/>
+        <w:ind w:left="360" w:leftChars="0" w:right="-58" w:rightChars="0" w:firstLine="416" w:firstLineChars="0"/>
+        <w:rPr>
+          <w:rFonts w:hint="default" w:ascii="inherit" w:hAnsi="inherit" w:eastAsia="宋体" w:cs="Helvetica"/>
+          <w:b w:val="0"/>
+          <w:bCs w:val="0"/>
+          <w:color w:val="0000FF"/>
+          <w:kern w:val="0"/>
+          <w:sz w:val="24"/>
+          <w:szCs w:val="24"/>
+          <w:lang w:val="en-US" w:eastAsia="zh-CN"/>
+        </w:rPr>
+      </w:pPr>
+      <w:r>
+        <w:rPr>
+          <w:rFonts w:hint="eastAsia" w:ascii="inherit" w:hAnsi="inherit" w:eastAsia="宋体" w:cs="Helvetica"/>
+          <w:b/>
+          <w:bCs/>
+          <w:color w:val="0000FF"/>
+          <w:kern w:val="0"/>
+          <w:sz w:val="24"/>
+          <w:szCs w:val="24"/>
+          <w:lang w:val="en-US" w:eastAsia="zh-CN"/>
+        </w:rPr>
+        <w:t>流量控制：</w:t>
+      </w:r>
+      <w:r>
+        <w:rPr>
+          <w:rFonts w:hint="eastAsia" w:ascii="inherit" w:hAnsi="inherit" w:eastAsia="宋体" w:cs="Helvetica"/>
+          <w:b w:val="0"/>
+          <w:bCs w:val="0"/>
+          <w:color w:val="0000FF"/>
+          <w:kern w:val="0"/>
+          <w:sz w:val="24"/>
+          <w:szCs w:val="24"/>
+          <w:lang w:val="en-US" w:eastAsia="zh-CN"/>
+        </w:rPr>
+        <w:t>与</w:t>
+      </w:r>
+      <w:r>
+        <w:rPr>
+          <w:rFonts w:hint="eastAsia" w:ascii="inherit" w:hAnsi="inherit" w:eastAsia="宋体" w:cs="Helvetica"/>
+          <w:b/>
+          <w:bCs/>
+          <w:color w:val="0000FF"/>
+          <w:kern w:val="0"/>
+          <w:sz w:val="24"/>
+          <w:szCs w:val="24"/>
+          <w:lang w:val="en-US" w:eastAsia="zh-CN"/>
+        </w:rPr>
+        <w:t>点到点的通信量</w:t>
+      </w:r>
+      <w:r>
+        <w:rPr>
+          <w:rFonts w:hint="eastAsia" w:ascii="inherit" w:hAnsi="inherit" w:eastAsia="宋体" w:cs="Helvetica"/>
+          <w:b w:val="0"/>
+          <w:bCs w:val="0"/>
+          <w:color w:val="0000FF"/>
+          <w:kern w:val="0"/>
+          <w:sz w:val="24"/>
+          <w:szCs w:val="24"/>
+          <w:lang w:val="en-US" w:eastAsia="zh-CN"/>
+        </w:rPr>
+        <w:t>有关，主要要去解决</w:t>
+      </w:r>
+      <w:r>
+        <w:rPr>
+          <w:rFonts w:hint="eastAsia" w:ascii="inherit" w:hAnsi="inherit" w:eastAsia="宋体" w:cs="Helvetica"/>
+          <w:b/>
+          <w:bCs/>
+          <w:color w:val="0000FF"/>
+          <w:kern w:val="0"/>
+          <w:sz w:val="24"/>
+          <w:szCs w:val="24"/>
+          <w:lang w:val="en-US" w:eastAsia="zh-CN"/>
+        </w:rPr>
+        <w:t>发送方发送速率过高导致接收方缓冲区溢出的问题</w:t>
+      </w:r>
+      <w:r>
+        <w:rPr>
+          <w:rFonts w:hint="eastAsia" w:ascii="inherit" w:hAnsi="inherit" w:eastAsia="宋体" w:cs="Helvetica"/>
+          <w:b w:val="0"/>
+          <w:bCs w:val="0"/>
+          <w:color w:val="0000FF"/>
+          <w:kern w:val="0"/>
+          <w:sz w:val="24"/>
+          <w:szCs w:val="24"/>
+          <w:lang w:val="en-US" w:eastAsia="zh-CN"/>
+        </w:rPr>
+        <w:t>，是一个</w:t>
+      </w:r>
+      <w:r>
+        <w:rPr>
+          <w:rFonts w:hint="eastAsia" w:ascii="inherit" w:hAnsi="inherit" w:eastAsia="宋体" w:cs="Helvetica"/>
+          <w:b/>
+          <w:bCs/>
+          <w:color w:val="0000FF"/>
+          <w:kern w:val="0"/>
+          <w:sz w:val="24"/>
+          <w:szCs w:val="24"/>
+          <w:lang w:val="en-US" w:eastAsia="zh-CN"/>
+        </w:rPr>
+        <w:t>局部性</w:t>
+      </w:r>
+      <w:r>
+        <w:rPr>
+          <w:rFonts w:hint="eastAsia" w:ascii="inherit" w:hAnsi="inherit" w:eastAsia="宋体" w:cs="Helvetica"/>
+          <w:b w:val="0"/>
+          <w:bCs w:val="0"/>
+          <w:color w:val="0000FF"/>
+          <w:kern w:val="0"/>
+          <w:sz w:val="24"/>
+          <w:szCs w:val="24"/>
+          <w:lang w:val="en-US" w:eastAsia="zh-CN"/>
+        </w:rPr>
+        <w:t>的问题</w:t>
+      </w:r>
+    </w:p>
+    <w:p>
+      <w:pPr>
+        <w:pStyle w:val="6"/>
+        <w:widowControl/>
+        <w:numPr>
+          <w:ilvl w:val="0"/>
+          <w:numId w:val="1"/>
+        </w:numPr>
+        <w:shd w:val="clear" w:color="auto" w:fill="FFFFFF"/>
+        <w:ind w:right="-58" w:firstLineChars="0"/>
+        <w:rPr>
+          <w:rFonts w:hint="default" w:ascii="inherit" w:hAnsi="inherit" w:eastAsia="宋体" w:cs="Helvetica"/>
+          <w:b/>
+          <w:bCs/>
+          <w:color w:val="000000" w:themeColor="text1"/>
+          <w:kern w:val="0"/>
+          <w:sz w:val="24"/>
+          <w:szCs w:val="24"/>
+          <w:lang w:val="en-US" w:eastAsia="zh-CN"/>
+          <w14:textFill>
+            <w14:solidFill>
+              <w14:schemeClr w14:val="tx1"/>
+            </w14:solidFill>
+          </w14:textFill>
+        </w:rPr>
+      </w:pPr>
+      <w:r>
+        <w:rPr>
+          <w:rFonts w:hint="eastAsia" w:ascii="inherit" w:hAnsi="inherit" w:eastAsia="宋体" w:cs="Helvetica"/>
+          <w:b/>
+          <w:bCs/>
+          <w:color w:val="000000" w:themeColor="text1"/>
+          <w:kern w:val="0"/>
+          <w:sz w:val="24"/>
+          <w:szCs w:val="24"/>
+          <w:lang w:val="en-US" w:eastAsia="zh-CN"/>
+          <w14:textFill>
+            <w14:solidFill>
+              <w14:schemeClr w14:val="tx1"/>
+            </w14:solidFill>
+          </w14:textFill>
+        </w:rPr>
+        <w:t>拥塞控制的常用方法</w:t>
+      </w:r>
+    </w:p>
+    <w:p>
+      <w:pPr>
+        <w:pStyle w:val="6"/>
+        <w:widowControl/>
+        <w:numPr>
+          <w:ilvl w:val="0"/>
+          <w:numId w:val="0"/>
+        </w:numPr>
+        <w:shd w:val="clear" w:color="auto" w:fill="FFFFFF"/>
+        <w:ind w:left="360" w:leftChars="0" w:right="-58" w:rightChars="0" w:firstLine="416" w:firstLineChars="0"/>
+        <w:rPr>
+          <w:rFonts w:hint="eastAsia" w:ascii="inherit" w:hAnsi="inherit" w:eastAsia="宋体" w:cs="Helvetica"/>
+          <w:b w:val="0"/>
+          <w:bCs w:val="0"/>
+          <w:color w:val="0000FF"/>
+          <w:kern w:val="0"/>
+          <w:sz w:val="24"/>
+          <w:szCs w:val="24"/>
+          <w:lang w:val="en-US" w:eastAsia="zh-CN"/>
+        </w:rPr>
+      </w:pPr>
+      <w:r>
+        <w:rPr>
+          <w:rFonts w:hint="eastAsia" w:ascii="inherit" w:hAnsi="inherit" w:eastAsia="宋体" w:cs="Helvetica"/>
+          <w:b/>
+          <w:bCs/>
+          <w:color w:val="0000FF"/>
+          <w:kern w:val="0"/>
+          <w:sz w:val="24"/>
+          <w:szCs w:val="24"/>
+          <w:lang w:val="en-US" w:eastAsia="zh-CN"/>
+        </w:rPr>
+        <w:t>开环控制：</w:t>
+      </w:r>
+      <w:r>
+        <w:rPr>
+          <w:rFonts w:hint="eastAsia" w:ascii="inherit" w:hAnsi="inherit" w:eastAsia="宋体" w:cs="Helvetica"/>
+          <w:b w:val="0"/>
+          <w:bCs w:val="0"/>
+          <w:color w:val="0000FF"/>
+          <w:kern w:val="0"/>
+          <w:sz w:val="24"/>
+          <w:szCs w:val="24"/>
+          <w:lang w:val="en-US" w:eastAsia="zh-CN"/>
+        </w:rPr>
+        <w:t>通过事先</w:t>
+      </w:r>
+      <w:r>
+        <w:rPr>
+          <w:rFonts w:hint="eastAsia" w:ascii="inherit" w:hAnsi="inherit" w:eastAsia="宋体" w:cs="Helvetica"/>
+          <w:b/>
+          <w:bCs/>
+          <w:color w:val="0000FF"/>
+          <w:kern w:val="0"/>
+          <w:sz w:val="24"/>
+          <w:szCs w:val="24"/>
+          <w:lang w:val="en-US" w:eastAsia="zh-CN"/>
+        </w:rPr>
+        <w:t>好的设计</w:t>
+      </w:r>
+      <w:r>
+        <w:rPr>
+          <w:rFonts w:hint="eastAsia" w:ascii="inherit" w:hAnsi="inherit" w:eastAsia="宋体" w:cs="Helvetica"/>
+          <w:b w:val="0"/>
+          <w:bCs w:val="0"/>
+          <w:color w:val="0000FF"/>
+          <w:kern w:val="0"/>
+          <w:sz w:val="24"/>
+          <w:szCs w:val="24"/>
+          <w:lang w:val="en-US" w:eastAsia="zh-CN"/>
+        </w:rPr>
+        <w:t>来解决问题，</w:t>
+      </w:r>
+      <w:r>
+        <w:rPr>
+          <w:rFonts w:hint="eastAsia" w:ascii="inherit" w:hAnsi="inherit" w:eastAsia="宋体" w:cs="Helvetica"/>
+          <w:b/>
+          <w:bCs/>
+          <w:color w:val="0000FF"/>
+          <w:kern w:val="0"/>
+          <w:sz w:val="24"/>
+          <w:szCs w:val="24"/>
+          <w:lang w:val="en-US" w:eastAsia="zh-CN"/>
+        </w:rPr>
+        <w:t>避免拥塞的发生</w:t>
+      </w:r>
+      <w:r>
+        <w:rPr>
+          <w:rFonts w:hint="eastAsia" w:ascii="inherit" w:hAnsi="inherit" w:eastAsia="宋体" w:cs="Helvetica"/>
+          <w:b w:val="0"/>
+          <w:bCs w:val="0"/>
+          <w:color w:val="0000FF"/>
+          <w:kern w:val="0"/>
+          <w:sz w:val="24"/>
+          <w:szCs w:val="24"/>
+          <w:lang w:val="en-US" w:eastAsia="zh-CN"/>
+        </w:rPr>
+        <w:t>；拥塞控制时，</w:t>
+      </w:r>
+      <w:r>
+        <w:rPr>
+          <w:rFonts w:hint="eastAsia" w:ascii="inherit" w:hAnsi="inherit" w:eastAsia="宋体" w:cs="Helvetica"/>
+          <w:b/>
+          <w:bCs/>
+          <w:color w:val="0000FF"/>
+          <w:kern w:val="0"/>
+          <w:sz w:val="24"/>
+          <w:szCs w:val="24"/>
+          <w:lang w:val="en-US" w:eastAsia="zh-CN"/>
+        </w:rPr>
+        <w:t>不需要考虑当前的网络状态</w:t>
+      </w:r>
+    </w:p>
+    <w:p>
+      <w:pPr>
+        <w:pStyle w:val="6"/>
+        <w:widowControl/>
+        <w:numPr>
+          <w:ilvl w:val="0"/>
+          <w:numId w:val="0"/>
+        </w:numPr>
+        <w:shd w:val="clear" w:color="auto" w:fill="FFFFFF"/>
+        <w:ind w:left="360" w:leftChars="0" w:right="-58" w:rightChars="0" w:firstLine="416" w:firstLineChars="0"/>
+        <w:rPr>
+          <w:rFonts w:hint="default" w:ascii="inherit" w:hAnsi="inherit" w:eastAsia="宋体" w:cs="Helvetica"/>
+          <w:b w:val="0"/>
+          <w:bCs w:val="0"/>
+          <w:color w:val="0000FF"/>
+          <w:kern w:val="0"/>
+          <w:sz w:val="24"/>
+          <w:szCs w:val="24"/>
+          <w:lang w:val="en-US" w:eastAsia="zh-CN"/>
+        </w:rPr>
+      </w:pPr>
+      <w:r>
+        <w:rPr>
+          <w:rFonts w:hint="eastAsia" w:ascii="inherit" w:hAnsi="inherit" w:eastAsia="宋体" w:cs="Helvetica"/>
+          <w:b/>
+          <w:bCs/>
+          <w:color w:val="0000FF"/>
+          <w:kern w:val="0"/>
+          <w:sz w:val="24"/>
+          <w:szCs w:val="24"/>
+          <w:lang w:val="en-US" w:eastAsia="zh-CN"/>
+        </w:rPr>
+        <w:t>闭环控制：</w:t>
+      </w:r>
+      <w:r>
+        <w:rPr>
+          <w:rFonts w:hint="eastAsia" w:ascii="inherit" w:hAnsi="inherit" w:eastAsia="宋体" w:cs="Helvetica"/>
+          <w:b w:val="0"/>
+          <w:bCs w:val="0"/>
+          <w:color w:val="0000FF"/>
+          <w:kern w:val="0"/>
+          <w:sz w:val="24"/>
+          <w:szCs w:val="24"/>
+          <w:lang w:val="en-US" w:eastAsia="zh-CN"/>
+        </w:rPr>
+        <w:t>通过</w:t>
+      </w:r>
+      <w:r>
+        <w:rPr>
+          <w:rFonts w:hint="eastAsia" w:ascii="inherit" w:hAnsi="inherit" w:eastAsia="宋体" w:cs="Helvetica"/>
+          <w:b/>
+          <w:bCs/>
+          <w:color w:val="0000FF"/>
+          <w:kern w:val="0"/>
+          <w:sz w:val="24"/>
+          <w:szCs w:val="24"/>
+          <w:lang w:val="en-US" w:eastAsia="zh-CN"/>
+        </w:rPr>
+        <w:t>反馈机制</w:t>
+      </w:r>
+      <w:r>
+        <w:rPr>
+          <w:rFonts w:hint="eastAsia" w:ascii="inherit" w:hAnsi="inherit" w:eastAsia="宋体" w:cs="Helvetica"/>
+          <w:b w:val="0"/>
+          <w:bCs w:val="0"/>
+          <w:color w:val="0000FF"/>
+          <w:kern w:val="0"/>
+          <w:sz w:val="24"/>
+          <w:szCs w:val="24"/>
+          <w:lang w:val="en-US" w:eastAsia="zh-CN"/>
+        </w:rPr>
+        <w:t>来解决拥塞。通过</w:t>
+      </w:r>
+      <w:r>
+        <w:rPr>
+          <w:rFonts w:hint="eastAsia" w:ascii="inherit" w:hAnsi="inherit" w:eastAsia="宋体" w:cs="Helvetica"/>
+          <w:b/>
+          <w:bCs/>
+          <w:color w:val="0000FF"/>
+          <w:kern w:val="0"/>
+          <w:sz w:val="24"/>
+          <w:szCs w:val="24"/>
+          <w:lang w:val="en-US" w:eastAsia="zh-CN"/>
+        </w:rPr>
+        <w:t>监控系统</w:t>
+      </w:r>
+      <w:r>
+        <w:rPr>
+          <w:rFonts w:hint="eastAsia" w:ascii="inherit" w:hAnsi="inherit" w:eastAsia="宋体" w:cs="Helvetica"/>
+          <w:b w:val="0"/>
+          <w:bCs w:val="0"/>
+          <w:color w:val="0000FF"/>
+          <w:kern w:val="0"/>
+          <w:sz w:val="24"/>
+          <w:szCs w:val="24"/>
+          <w:lang w:val="en-US" w:eastAsia="zh-CN"/>
+        </w:rPr>
+        <w:t>，发现</w:t>
+      </w:r>
+      <w:r>
+        <w:rPr>
+          <w:rFonts w:hint="eastAsia" w:ascii="inherit" w:hAnsi="inherit" w:eastAsia="宋体" w:cs="Helvetica"/>
+          <w:b/>
+          <w:bCs/>
+          <w:color w:val="0000FF"/>
+          <w:kern w:val="0"/>
+          <w:sz w:val="24"/>
+          <w:szCs w:val="24"/>
+          <w:lang w:val="en-US" w:eastAsia="zh-CN"/>
+        </w:rPr>
+        <w:t>何时何地</w:t>
+      </w:r>
+      <w:r>
+        <w:rPr>
+          <w:rFonts w:hint="eastAsia" w:ascii="inherit" w:hAnsi="inherit" w:eastAsia="宋体" w:cs="Helvetica"/>
+          <w:b w:val="0"/>
+          <w:bCs w:val="0"/>
+          <w:color w:val="0000FF"/>
+          <w:kern w:val="0"/>
+          <w:sz w:val="24"/>
+          <w:szCs w:val="24"/>
+          <w:lang w:val="en-US" w:eastAsia="zh-CN"/>
+        </w:rPr>
+        <w:t>发生了拥塞；把发生拥塞的信息发送给</w:t>
+      </w:r>
+      <w:r>
+        <w:rPr>
+          <w:rFonts w:hint="eastAsia" w:ascii="inherit" w:hAnsi="inherit" w:eastAsia="宋体" w:cs="Helvetica"/>
+          <w:b/>
+          <w:bCs/>
+          <w:color w:val="0000FF"/>
+          <w:kern w:val="0"/>
+          <w:sz w:val="24"/>
+          <w:szCs w:val="24"/>
+          <w:lang w:val="en-US" w:eastAsia="zh-CN"/>
+        </w:rPr>
+        <w:t>能采取行动的站点</w:t>
+      </w:r>
+      <w:r>
+        <w:rPr>
+          <w:rFonts w:hint="eastAsia" w:ascii="inherit" w:hAnsi="inherit" w:eastAsia="宋体" w:cs="Helvetica"/>
+          <w:b w:val="0"/>
+          <w:bCs w:val="0"/>
+          <w:color w:val="0000FF"/>
+          <w:kern w:val="0"/>
+          <w:sz w:val="24"/>
+          <w:szCs w:val="24"/>
+          <w:lang w:val="en-US" w:eastAsia="zh-CN"/>
+        </w:rPr>
+        <w:t>；调整系统，来解决拥塞问题</w:t>
+      </w:r>
+    </w:p>
+    <w:p>
+      <w:pPr>
+        <w:pStyle w:val="6"/>
+        <w:widowControl/>
+        <w:numPr>
+          <w:ilvl w:val="0"/>
+          <w:numId w:val="0"/>
+        </w:numPr>
+        <w:shd w:val="clear" w:color="auto" w:fill="FFFFFF"/>
+        <w:ind w:right="-58" w:rightChars="0"/>
+        <w:rPr>
+          <w:rFonts w:hint="default" w:ascii="inherit" w:hAnsi="inherit" w:eastAsia="宋体" w:cs="Helvetica"/>
+          <w:b/>
+          <w:bCs/>
+          <w:color w:val="000000" w:themeColor="text1"/>
+          <w:kern w:val="0"/>
+          <w:sz w:val="24"/>
+          <w:szCs w:val="24"/>
+          <w:lang w:val="en-US" w:eastAsia="zh-CN"/>
+          <w14:textFill>
+            <w14:solidFill>
+              <w14:schemeClr w14:val="tx1"/>
+            </w14:solidFill>
+          </w14:textFill>
+        </w:rPr>
+      </w:pPr>
+    </w:p>
+    <w:p>
+      <w:pPr>
+        <w:pStyle w:val="6"/>
+        <w:widowControl/>
+        <w:numPr>
+          <w:ilvl w:val="0"/>
+          <w:numId w:val="1"/>
+        </w:numPr>
+        <w:shd w:val="clear" w:color="auto" w:fill="FFFFFF"/>
+        <w:ind w:right="-58" w:firstLineChars="0"/>
+        <w:rPr>
+          <w:rFonts w:hint="default" w:ascii="inherit" w:hAnsi="inherit" w:eastAsia="宋体" w:cs="Helvetica"/>
+          <w:b/>
+          <w:bCs/>
+          <w:color w:val="000000" w:themeColor="text1"/>
+          <w:kern w:val="0"/>
+          <w:sz w:val="24"/>
+          <w:szCs w:val="24"/>
+          <w:lang w:val="en-US" w:eastAsia="zh-CN"/>
+          <w14:textFill>
+            <w14:solidFill>
+              <w14:schemeClr w14:val="tx1"/>
+            </w14:solidFill>
+          </w14:textFill>
+        </w:rPr>
+      </w:pPr>
+      <w:r>
+        <w:rPr>
+          <w:rFonts w:hint="eastAsia" w:ascii="inherit" w:hAnsi="inherit" w:eastAsia="宋体" w:cs="Helvetica"/>
+          <w:b/>
+          <w:bCs/>
+          <w:color w:val="000000" w:themeColor="text1"/>
+          <w:kern w:val="0"/>
+          <w:sz w:val="24"/>
+          <w:szCs w:val="24"/>
+          <w:lang w:val="en-US" w:eastAsia="zh-CN"/>
+          <w14:textFill>
+            <w14:solidFill>
+              <w14:schemeClr w14:val="tx1"/>
+            </w14:solidFill>
+          </w14:textFill>
+        </w:rPr>
+        <w:t>※※※UDP协议的特点</w:t>
+      </w:r>
+    </w:p>
+    <w:p>
+      <w:pPr>
+        <w:pStyle w:val="6"/>
+        <w:widowControl/>
+        <w:numPr>
+          <w:ilvl w:val="0"/>
+          <w:numId w:val="0"/>
+        </w:numPr>
+        <w:shd w:val="clear" w:color="auto" w:fill="FFFFFF"/>
+        <w:ind w:left="360" w:leftChars="0" w:right="-58" w:rightChars="0" w:firstLine="416" w:firstLineChars="0"/>
+        <w:rPr>
+          <w:rFonts w:hint="eastAsia" w:ascii="inherit" w:hAnsi="inherit" w:eastAsia="宋体" w:cs="Helvetica"/>
+          <w:b w:val="0"/>
+          <w:bCs w:val="0"/>
+          <w:color w:val="0000FF"/>
+          <w:kern w:val="0"/>
+          <w:sz w:val="24"/>
+          <w:szCs w:val="24"/>
+          <w:lang w:val="en-US" w:eastAsia="zh-CN"/>
+        </w:rPr>
+      </w:pPr>
+      <w:r>
+        <w:rPr>
+          <w:rFonts w:hint="eastAsia" w:ascii="inherit" w:hAnsi="inherit" w:eastAsia="宋体" w:cs="Helvetica"/>
+          <w:b/>
+          <w:bCs/>
+          <w:color w:val="0000FF"/>
+          <w:kern w:val="0"/>
+          <w:sz w:val="24"/>
+          <w:szCs w:val="24"/>
+          <w:lang w:val="en-US" w:eastAsia="zh-CN"/>
+        </w:rPr>
+        <w:t>不需要建立连接，时延小</w:t>
+      </w:r>
+    </w:p>
+    <w:p>
+      <w:pPr>
+        <w:pStyle w:val="6"/>
+        <w:widowControl/>
+        <w:numPr>
+          <w:ilvl w:val="0"/>
+          <w:numId w:val="0"/>
+        </w:numPr>
+        <w:shd w:val="clear" w:color="auto" w:fill="FFFFFF"/>
+        <w:ind w:left="360" w:leftChars="0" w:right="-58" w:rightChars="0" w:firstLine="416" w:firstLineChars="0"/>
+        <w:rPr>
+          <w:rFonts w:hint="eastAsia" w:ascii="inherit" w:hAnsi="inherit" w:eastAsia="宋体" w:cs="Helvetica"/>
+          <w:b w:val="0"/>
+          <w:bCs w:val="0"/>
+          <w:color w:val="0000FF"/>
+          <w:kern w:val="0"/>
+          <w:sz w:val="24"/>
+          <w:szCs w:val="24"/>
+          <w:lang w:val="en-US" w:eastAsia="zh-CN"/>
+        </w:rPr>
+      </w:pPr>
+      <w:r>
+        <w:rPr>
+          <w:rFonts w:hint="eastAsia" w:ascii="inherit" w:hAnsi="inherit" w:eastAsia="宋体" w:cs="Helvetica"/>
+          <w:b/>
+          <w:bCs/>
+          <w:color w:val="0000FF"/>
+          <w:kern w:val="0"/>
+          <w:sz w:val="24"/>
+          <w:szCs w:val="24"/>
+          <w:lang w:val="en-US" w:eastAsia="zh-CN"/>
+        </w:rPr>
+        <w:t>实现简单</w:t>
+      </w:r>
+      <w:r>
+        <w:rPr>
+          <w:rFonts w:hint="eastAsia" w:ascii="inherit" w:hAnsi="inherit" w:eastAsia="宋体" w:cs="Helvetica"/>
+          <w:b w:val="0"/>
+          <w:bCs w:val="0"/>
+          <w:color w:val="0000FF"/>
+          <w:kern w:val="0"/>
+          <w:sz w:val="24"/>
+          <w:szCs w:val="24"/>
+          <w:lang w:val="en-US" w:eastAsia="zh-CN"/>
+        </w:rPr>
+        <w:t>：接收方与发送方都不需要建立链路连接</w:t>
+      </w:r>
+    </w:p>
+    <w:p>
+      <w:pPr>
+        <w:pStyle w:val="6"/>
+        <w:widowControl/>
+        <w:numPr>
+          <w:ilvl w:val="0"/>
+          <w:numId w:val="0"/>
+        </w:numPr>
+        <w:shd w:val="clear" w:color="auto" w:fill="FFFFFF"/>
+        <w:ind w:left="360" w:leftChars="0" w:right="-58" w:rightChars="0" w:firstLine="416" w:firstLineChars="0"/>
+        <w:rPr>
+          <w:rFonts w:hint="eastAsia" w:ascii="inherit" w:hAnsi="inherit" w:eastAsia="宋体" w:cs="Helvetica"/>
+          <w:b w:val="0"/>
+          <w:bCs w:val="0"/>
+          <w:color w:val="0000FF"/>
+          <w:kern w:val="0"/>
+          <w:sz w:val="24"/>
+          <w:szCs w:val="24"/>
+          <w:lang w:val="en-US" w:eastAsia="zh-CN"/>
+        </w:rPr>
+      </w:pPr>
+      <w:r>
+        <w:rPr>
+          <w:rFonts w:hint="eastAsia" w:ascii="inherit" w:hAnsi="inherit" w:eastAsia="宋体" w:cs="Helvetica"/>
+          <w:b/>
+          <w:bCs/>
+          <w:color w:val="0000FF"/>
+          <w:kern w:val="0"/>
+          <w:sz w:val="24"/>
+          <w:szCs w:val="24"/>
+          <w:lang w:val="en-US" w:eastAsia="zh-CN"/>
+        </w:rPr>
+        <w:t>UDP报头为8B</w:t>
+      </w:r>
+      <w:r>
+        <w:rPr>
+          <w:rFonts w:hint="eastAsia" w:ascii="inherit" w:hAnsi="inherit" w:eastAsia="宋体" w:cs="Helvetica"/>
+          <w:b w:val="0"/>
+          <w:bCs w:val="0"/>
+          <w:color w:val="0000FF"/>
+          <w:kern w:val="0"/>
+          <w:sz w:val="24"/>
+          <w:szCs w:val="24"/>
+          <w:lang w:val="en-US" w:eastAsia="zh-CN"/>
+        </w:rPr>
+        <w:t>，相比于TCP的20B报头，</w:t>
+      </w:r>
+      <w:r>
+        <w:rPr>
+          <w:rFonts w:hint="eastAsia" w:ascii="inherit" w:hAnsi="inherit" w:eastAsia="宋体" w:cs="Helvetica"/>
+          <w:b/>
+          <w:bCs/>
+          <w:color w:val="0000FF"/>
+          <w:kern w:val="0"/>
+          <w:sz w:val="24"/>
+          <w:szCs w:val="24"/>
+          <w:lang w:val="en-US" w:eastAsia="zh-CN"/>
+        </w:rPr>
+        <w:t>报头小</w:t>
+      </w:r>
+      <w:r>
+        <w:rPr>
+          <w:rFonts w:hint="eastAsia" w:ascii="inherit" w:hAnsi="inherit" w:eastAsia="宋体" w:cs="Helvetica"/>
+          <w:b w:val="0"/>
+          <w:bCs w:val="0"/>
+          <w:color w:val="0000FF"/>
+          <w:kern w:val="0"/>
+          <w:sz w:val="24"/>
+          <w:szCs w:val="24"/>
+          <w:lang w:val="en-US" w:eastAsia="zh-CN"/>
+        </w:rPr>
+        <w:t>，系统开销低</w:t>
+      </w:r>
+    </w:p>
+    <w:p>
+      <w:pPr>
+        <w:pStyle w:val="6"/>
+        <w:widowControl/>
+        <w:numPr>
+          <w:ilvl w:val="0"/>
+          <w:numId w:val="0"/>
+        </w:numPr>
+        <w:shd w:val="clear" w:color="auto" w:fill="FFFFFF"/>
+        <w:ind w:left="360" w:leftChars="0" w:right="-58" w:rightChars="0" w:firstLine="416" w:firstLineChars="0"/>
+        <w:rPr>
+          <w:rFonts w:hint="eastAsia" w:ascii="inherit" w:hAnsi="inherit" w:eastAsia="宋体" w:cs="Helvetica"/>
+          <w:b/>
+          <w:bCs/>
+          <w:color w:val="0000FF"/>
+          <w:kern w:val="0"/>
+          <w:sz w:val="24"/>
+          <w:szCs w:val="24"/>
+          <w:lang w:val="en-US" w:eastAsia="zh-CN"/>
+        </w:rPr>
+      </w:pPr>
+      <w:r>
+        <w:rPr>
+          <w:rFonts w:hint="eastAsia" w:ascii="inherit" w:hAnsi="inherit" w:eastAsia="宋体" w:cs="Helvetica"/>
+          <w:b/>
+          <w:bCs/>
+          <w:color w:val="0000FF"/>
+          <w:kern w:val="0"/>
+          <w:sz w:val="24"/>
+          <w:szCs w:val="24"/>
+          <w:lang w:val="en-US" w:eastAsia="zh-CN"/>
+        </w:rPr>
+        <w:t>无拥塞控制</w:t>
+      </w:r>
+      <w:r>
+        <w:rPr>
+          <w:rFonts w:hint="eastAsia" w:ascii="inherit" w:hAnsi="inherit" w:eastAsia="宋体" w:cs="Helvetica"/>
+          <w:b w:val="0"/>
+          <w:bCs w:val="0"/>
+          <w:color w:val="0000FF"/>
+          <w:kern w:val="0"/>
+          <w:sz w:val="24"/>
+          <w:szCs w:val="24"/>
+          <w:lang w:val="en-US" w:eastAsia="zh-CN"/>
+        </w:rPr>
+        <w:t>：可以</w:t>
+      </w:r>
+      <w:r>
+        <w:rPr>
+          <w:rFonts w:hint="eastAsia" w:ascii="inherit" w:hAnsi="inherit" w:eastAsia="宋体" w:cs="Helvetica"/>
+          <w:b/>
+          <w:bCs/>
+          <w:color w:val="0000FF"/>
+          <w:kern w:val="0"/>
+          <w:sz w:val="24"/>
+          <w:szCs w:val="24"/>
+          <w:lang w:val="en-US" w:eastAsia="zh-CN"/>
+        </w:rPr>
+        <w:t>随时按需发送，响应性优良</w:t>
+      </w:r>
+    </w:p>
+    <w:p>
+      <w:pPr>
+        <w:pStyle w:val="6"/>
+        <w:widowControl/>
+        <w:numPr>
+          <w:ilvl w:val="0"/>
+          <w:numId w:val="0"/>
+        </w:numPr>
+        <w:shd w:val="clear" w:color="auto" w:fill="FFFFFF"/>
+        <w:ind w:left="360" w:leftChars="0" w:right="-58" w:rightChars="0" w:firstLine="416" w:firstLineChars="0"/>
+        <w:rPr>
+          <w:rFonts w:hint="default" w:ascii="inherit" w:hAnsi="inherit" w:eastAsia="宋体" w:cs="Helvetica"/>
+          <w:b/>
+          <w:bCs/>
+          <w:color w:val="0000FF"/>
+          <w:kern w:val="0"/>
+          <w:sz w:val="24"/>
+          <w:szCs w:val="24"/>
+          <w:lang w:val="en-US" w:eastAsia="zh-CN"/>
+        </w:rPr>
+      </w:pPr>
+      <w:r>
+        <w:rPr>
+          <w:rFonts w:hint="eastAsia" w:ascii="inherit" w:hAnsi="inherit" w:eastAsia="宋体" w:cs="Helvetica"/>
+          <w:b/>
+          <w:bCs/>
+          <w:color w:val="0000FF"/>
+          <w:kern w:val="0"/>
+          <w:sz w:val="24"/>
+          <w:szCs w:val="24"/>
+          <w:lang w:val="en-US" w:eastAsia="zh-CN"/>
+        </w:rPr>
+        <w:t>UDP协议面向报文</w:t>
+      </w:r>
+    </w:p>
+    <w:p>
+      <w:pPr>
+        <w:pStyle w:val="6"/>
+        <w:widowControl/>
+        <w:numPr>
+          <w:ilvl w:val="0"/>
+          <w:numId w:val="0"/>
+        </w:numPr>
+        <w:shd w:val="clear" w:color="auto" w:fill="FFFFFF"/>
+        <w:ind w:right="-58" w:rightChars="0"/>
+        <w:rPr>
+          <w:rFonts w:hint="default" w:ascii="inherit" w:hAnsi="inherit" w:eastAsia="宋体" w:cs="Helvetica"/>
+          <w:b/>
+          <w:bCs/>
+          <w:color w:val="000000" w:themeColor="text1"/>
+          <w:kern w:val="0"/>
+          <w:sz w:val="24"/>
+          <w:szCs w:val="24"/>
+          <w:lang w:val="en-US" w:eastAsia="zh-CN"/>
+          <w14:textFill>
+            <w14:solidFill>
+              <w14:schemeClr w14:val="tx1"/>
+            </w14:solidFill>
+          </w14:textFill>
+        </w:rPr>
+      </w:pPr>
+    </w:p>
+    <w:p>
+      <w:pPr>
+        <w:pStyle w:val="6"/>
+        <w:widowControl/>
+        <w:numPr>
+          <w:ilvl w:val="0"/>
+          <w:numId w:val="1"/>
+        </w:numPr>
+        <w:shd w:val="clear" w:color="auto" w:fill="FFFFFF"/>
+        <w:ind w:right="-58" w:firstLineChars="0"/>
+        <w:rPr>
+          <w:rFonts w:hint="default" w:ascii="inherit" w:hAnsi="inherit" w:eastAsia="宋体" w:cs="Helvetica"/>
+          <w:b/>
+          <w:bCs/>
+          <w:color w:val="000000" w:themeColor="text1"/>
+          <w:kern w:val="0"/>
+          <w:sz w:val="24"/>
+          <w:szCs w:val="24"/>
+          <w:lang w:val="en-US" w:eastAsia="zh-CN"/>
+          <w14:textFill>
+            <w14:solidFill>
+              <w14:schemeClr w14:val="tx1"/>
+            </w14:solidFill>
+          </w14:textFill>
+        </w:rPr>
+      </w:pPr>
+      <w:r>
+        <w:rPr>
+          <w:rFonts w:hint="eastAsia" w:ascii="inherit" w:hAnsi="inherit" w:eastAsia="宋体" w:cs="Helvetica"/>
+          <w:b/>
+          <w:bCs/>
+          <w:color w:val="000000" w:themeColor="text1"/>
+          <w:kern w:val="0"/>
+          <w:sz w:val="24"/>
+          <w:szCs w:val="24"/>
+          <w:lang w:val="en-US" w:eastAsia="zh-CN"/>
+          <w14:textFill>
+            <w14:solidFill>
+              <w14:schemeClr w14:val="tx1"/>
+            </w14:solidFill>
+          </w14:textFill>
+        </w:rPr>
+        <w:t>实时流媒体传输协议（RTP RTCP）</w:t>
+      </w:r>
+    </w:p>
+    <w:p>
+      <w:pPr>
+        <w:pStyle w:val="6"/>
+        <w:widowControl/>
+        <w:numPr>
+          <w:ilvl w:val="0"/>
+          <w:numId w:val="0"/>
+        </w:numPr>
+        <w:shd w:val="clear" w:color="auto" w:fill="FFFFFF"/>
+        <w:ind w:left="360" w:leftChars="0" w:right="-58" w:rightChars="0" w:firstLine="416" w:firstLineChars="0"/>
+        <w:rPr>
+          <w:rFonts w:hint="eastAsia" w:ascii="inherit" w:hAnsi="inherit" w:eastAsia="宋体" w:cs="Helvetica"/>
+          <w:b w:val="0"/>
+          <w:bCs w:val="0"/>
+          <w:color w:val="0000FF"/>
+          <w:kern w:val="0"/>
+          <w:sz w:val="24"/>
+          <w:szCs w:val="24"/>
+          <w:lang w:val="en-US" w:eastAsia="zh-CN"/>
+        </w:rPr>
+      </w:pPr>
+      <w:r>
+        <w:rPr>
+          <w:rFonts w:hint="eastAsia" w:ascii="inherit" w:hAnsi="inherit" w:eastAsia="宋体" w:cs="Helvetica"/>
+          <w:b/>
+          <w:bCs/>
+          <w:color w:val="0000FF"/>
+          <w:kern w:val="0"/>
+          <w:sz w:val="24"/>
+          <w:szCs w:val="24"/>
+          <w:lang w:val="en-US" w:eastAsia="zh-CN"/>
+        </w:rPr>
+        <w:t>实时传输协议RTP</w:t>
+      </w:r>
+      <w:r>
+        <w:rPr>
+          <w:rFonts w:hint="eastAsia" w:ascii="inherit" w:hAnsi="inherit" w:eastAsia="宋体" w:cs="Helvetica"/>
+          <w:b w:val="0"/>
+          <w:bCs w:val="0"/>
+          <w:color w:val="0000FF"/>
+          <w:kern w:val="0"/>
+          <w:sz w:val="24"/>
+          <w:szCs w:val="24"/>
+          <w:lang w:val="en-US" w:eastAsia="zh-CN"/>
+        </w:rPr>
+        <w:t>提供</w:t>
+      </w:r>
+      <w:r>
+        <w:rPr>
+          <w:rFonts w:hint="eastAsia" w:ascii="inherit" w:hAnsi="inherit" w:eastAsia="宋体" w:cs="Helvetica"/>
+          <w:b/>
+          <w:bCs/>
+          <w:color w:val="0000FF"/>
+          <w:kern w:val="0"/>
+          <w:sz w:val="24"/>
+          <w:szCs w:val="24"/>
+          <w:lang w:val="en-US" w:eastAsia="zh-CN"/>
+        </w:rPr>
+        <w:t>端到端的传输</w:t>
+      </w:r>
+      <w:r>
+        <w:rPr>
+          <w:rFonts w:hint="eastAsia" w:ascii="inherit" w:hAnsi="inherit" w:eastAsia="宋体" w:cs="Helvetica"/>
+          <w:b w:val="0"/>
+          <w:bCs w:val="0"/>
+          <w:color w:val="0000FF"/>
+          <w:kern w:val="0"/>
+          <w:sz w:val="24"/>
+          <w:szCs w:val="24"/>
+          <w:lang w:val="en-US" w:eastAsia="zh-CN"/>
+        </w:rPr>
+        <w:t>，它基于</w:t>
+      </w:r>
+      <w:r>
+        <w:rPr>
+          <w:rFonts w:hint="eastAsia" w:ascii="inherit" w:hAnsi="inherit" w:eastAsia="宋体" w:cs="Helvetica"/>
+          <w:b/>
+          <w:bCs/>
+          <w:color w:val="0000FF"/>
+          <w:kern w:val="0"/>
+          <w:sz w:val="24"/>
+          <w:szCs w:val="24"/>
+          <w:lang w:val="en-US" w:eastAsia="zh-CN"/>
+        </w:rPr>
+        <w:t>UDP协议</w:t>
+      </w:r>
+      <w:r>
+        <w:rPr>
+          <w:rFonts w:hint="eastAsia" w:ascii="inherit" w:hAnsi="inherit" w:eastAsia="宋体" w:cs="Helvetica"/>
+          <w:b w:val="0"/>
+          <w:bCs w:val="0"/>
+          <w:color w:val="0000FF"/>
+          <w:kern w:val="0"/>
+          <w:sz w:val="24"/>
+          <w:szCs w:val="24"/>
+          <w:lang w:val="en-US" w:eastAsia="zh-CN"/>
+        </w:rPr>
+        <w:t>，</w:t>
+      </w:r>
+      <w:r>
+        <w:rPr>
+          <w:rFonts w:hint="eastAsia" w:ascii="inherit" w:hAnsi="inherit" w:eastAsia="宋体" w:cs="Helvetica"/>
+          <w:b/>
+          <w:bCs/>
+          <w:color w:val="0000FF"/>
+          <w:kern w:val="0"/>
+          <w:sz w:val="24"/>
+          <w:szCs w:val="24"/>
+          <w:lang w:val="en-US" w:eastAsia="zh-CN"/>
+        </w:rPr>
+        <w:t>封装在UDP的数据部分之中</w:t>
+      </w:r>
+    </w:p>
+    <w:p>
+      <w:pPr>
+        <w:pStyle w:val="6"/>
+        <w:widowControl/>
+        <w:numPr>
+          <w:ilvl w:val="0"/>
+          <w:numId w:val="0"/>
+        </w:numPr>
+        <w:shd w:val="clear" w:color="auto" w:fill="FFFFFF"/>
+        <w:ind w:left="360" w:leftChars="0" w:right="-58" w:rightChars="0" w:firstLine="416" w:firstLineChars="0"/>
+        <w:rPr>
+          <w:rFonts w:hint="default" w:ascii="inherit" w:hAnsi="inherit" w:eastAsia="宋体" w:cs="Helvetica"/>
+          <w:b w:val="0"/>
+          <w:bCs w:val="0"/>
+          <w:color w:val="0000FF"/>
+          <w:kern w:val="0"/>
+          <w:sz w:val="24"/>
+          <w:szCs w:val="24"/>
+          <w:lang w:val="en-US" w:eastAsia="zh-CN"/>
+        </w:rPr>
+      </w:pPr>
+      <w:r>
+        <w:rPr>
+          <w:rFonts w:hint="eastAsia" w:ascii="inherit" w:hAnsi="inherit" w:eastAsia="宋体" w:cs="Helvetica"/>
+          <w:b w:val="0"/>
+          <w:bCs w:val="0"/>
+          <w:color w:val="0000FF"/>
+          <w:kern w:val="0"/>
+          <w:sz w:val="24"/>
+          <w:szCs w:val="24"/>
+          <w:lang w:val="en-US" w:eastAsia="zh-CN"/>
+        </w:rPr>
+        <w:t>实时传输控制协议</w:t>
+      </w:r>
+      <w:r>
+        <w:rPr>
+          <w:rFonts w:hint="eastAsia" w:ascii="inherit" w:hAnsi="inherit" w:eastAsia="宋体" w:cs="Helvetica"/>
+          <w:b/>
+          <w:bCs/>
+          <w:color w:val="0000FF"/>
+          <w:kern w:val="0"/>
+          <w:sz w:val="24"/>
+          <w:szCs w:val="24"/>
+          <w:lang w:val="en-US" w:eastAsia="zh-CN"/>
+        </w:rPr>
+        <w:t>RTCP与RTP配合使用</w:t>
+      </w:r>
+      <w:r>
+        <w:rPr>
+          <w:rFonts w:hint="eastAsia" w:ascii="inherit" w:hAnsi="inherit" w:eastAsia="宋体" w:cs="Helvetica"/>
+          <w:b w:val="0"/>
+          <w:bCs w:val="0"/>
+          <w:color w:val="0000FF"/>
+          <w:kern w:val="0"/>
+          <w:sz w:val="24"/>
+          <w:szCs w:val="24"/>
+          <w:lang w:val="en-US" w:eastAsia="zh-CN"/>
+        </w:rPr>
+        <w:t>，可以以</w:t>
+      </w:r>
+      <w:r>
+        <w:rPr>
+          <w:rFonts w:hint="eastAsia" w:ascii="inherit" w:hAnsi="inherit" w:eastAsia="宋体" w:cs="Helvetica"/>
+          <w:b/>
+          <w:bCs/>
+          <w:color w:val="0000FF"/>
+          <w:kern w:val="0"/>
+          <w:sz w:val="24"/>
+          <w:szCs w:val="24"/>
+          <w:lang w:val="en-US" w:eastAsia="zh-CN"/>
+        </w:rPr>
+        <w:t>有效的反馈</w:t>
+      </w:r>
+      <w:r>
+        <w:rPr>
+          <w:rFonts w:hint="eastAsia" w:ascii="inherit" w:hAnsi="inherit" w:eastAsia="宋体" w:cs="Helvetica"/>
+          <w:b w:val="0"/>
+          <w:bCs w:val="0"/>
+          <w:color w:val="0000FF"/>
+          <w:kern w:val="0"/>
+          <w:sz w:val="24"/>
+          <w:szCs w:val="24"/>
+          <w:lang w:val="en-US" w:eastAsia="zh-CN"/>
+        </w:rPr>
+        <w:t>和</w:t>
+      </w:r>
+      <w:r>
+        <w:rPr>
+          <w:rFonts w:hint="eastAsia" w:ascii="inherit" w:hAnsi="inherit" w:eastAsia="宋体" w:cs="Helvetica"/>
+          <w:b/>
+          <w:bCs/>
+          <w:color w:val="0000FF"/>
+          <w:kern w:val="0"/>
+          <w:sz w:val="24"/>
+          <w:szCs w:val="24"/>
+          <w:lang w:val="en-US" w:eastAsia="zh-CN"/>
+        </w:rPr>
+        <w:t>最小的开销</w:t>
+      </w:r>
+      <w:r>
+        <w:rPr>
+          <w:rFonts w:hint="eastAsia" w:ascii="inherit" w:hAnsi="inherit" w:eastAsia="宋体" w:cs="Helvetica"/>
+          <w:b w:val="0"/>
+          <w:bCs w:val="0"/>
+          <w:color w:val="0000FF"/>
+          <w:kern w:val="0"/>
+          <w:sz w:val="24"/>
+          <w:szCs w:val="24"/>
+          <w:lang w:val="en-US" w:eastAsia="zh-CN"/>
+        </w:rPr>
+        <w:t>使得</w:t>
+      </w:r>
+      <w:r>
+        <w:rPr>
+          <w:rFonts w:hint="eastAsia" w:ascii="inherit" w:hAnsi="inherit" w:eastAsia="宋体" w:cs="Helvetica"/>
+          <w:b/>
+          <w:bCs/>
+          <w:color w:val="0000FF"/>
+          <w:kern w:val="0"/>
+          <w:sz w:val="24"/>
+          <w:szCs w:val="24"/>
+          <w:lang w:val="en-US" w:eastAsia="zh-CN"/>
+        </w:rPr>
+        <w:t>传输效率最佳化</w:t>
+      </w:r>
+      <w:r>
+        <w:rPr>
+          <w:rFonts w:hint="eastAsia" w:ascii="inherit" w:hAnsi="inherit" w:eastAsia="宋体" w:cs="Helvetica"/>
+          <w:b w:val="0"/>
+          <w:bCs w:val="0"/>
+          <w:color w:val="0000FF"/>
+          <w:kern w:val="0"/>
+          <w:sz w:val="24"/>
+          <w:szCs w:val="24"/>
+          <w:lang w:val="en-US" w:eastAsia="zh-CN"/>
+        </w:rPr>
+        <w:t>，特别适合</w:t>
+      </w:r>
+      <w:r>
+        <w:rPr>
+          <w:rFonts w:hint="eastAsia" w:ascii="inherit" w:hAnsi="inherit" w:eastAsia="宋体" w:cs="Helvetica"/>
+          <w:b/>
+          <w:bCs/>
+          <w:color w:val="0000FF"/>
+          <w:kern w:val="0"/>
+          <w:sz w:val="24"/>
+          <w:szCs w:val="24"/>
+          <w:lang w:val="en-US" w:eastAsia="zh-CN"/>
+        </w:rPr>
+        <w:t>传输网上的实时数据</w:t>
+      </w:r>
+    </w:p>
+    <w:p>
+      <w:pPr>
+        <w:pStyle w:val="6"/>
+        <w:widowControl/>
+        <w:numPr>
+          <w:ilvl w:val="0"/>
+          <w:numId w:val="0"/>
+        </w:numPr>
+        <w:shd w:val="clear" w:color="auto" w:fill="FFFFFF"/>
+        <w:ind w:right="-58" w:rightChars="0"/>
+        <w:rPr>
+          <w:rFonts w:hint="default" w:ascii="inherit" w:hAnsi="inherit" w:eastAsia="宋体" w:cs="Helvetica"/>
+          <w:b/>
+          <w:bCs/>
+          <w:color w:val="000000" w:themeColor="text1"/>
+          <w:kern w:val="0"/>
+          <w:sz w:val="24"/>
+          <w:szCs w:val="24"/>
+          <w:lang w:val="en-US" w:eastAsia="zh-CN"/>
+          <w14:textFill>
+            <w14:solidFill>
+              <w14:schemeClr w14:val="tx1"/>
+            </w14:solidFill>
+          </w14:textFill>
+        </w:rPr>
+      </w:pPr>
+    </w:p>
+    <w:p>
+      <w:pPr>
+        <w:pStyle w:val="6"/>
+        <w:widowControl/>
+        <w:numPr>
+          <w:ilvl w:val="0"/>
+          <w:numId w:val="1"/>
+        </w:numPr>
+        <w:shd w:val="clear" w:color="auto" w:fill="FFFFFF"/>
+        <w:ind w:right="-58" w:firstLineChars="0"/>
+        <w:rPr>
+          <w:rFonts w:hint="default" w:ascii="inherit" w:hAnsi="inherit" w:eastAsia="宋体" w:cs="Helvetica"/>
+          <w:b/>
+          <w:bCs/>
+          <w:color w:val="000000" w:themeColor="text1"/>
+          <w:kern w:val="0"/>
+          <w:sz w:val="24"/>
+          <w:szCs w:val="24"/>
+          <w:lang w:val="en-US" w:eastAsia="zh-CN"/>
+          <w14:textFill>
+            <w14:solidFill>
+              <w14:schemeClr w14:val="tx1"/>
+            </w14:solidFill>
+          </w14:textFill>
+        </w:rPr>
+      </w:pPr>
+      <w:r>
+        <w:rPr>
+          <w:rFonts w:hint="eastAsia" w:ascii="inherit" w:hAnsi="inherit" w:eastAsia="宋体" w:cs="Helvetica"/>
+          <w:b/>
+          <w:bCs/>
+          <w:color w:val="000000" w:themeColor="text1"/>
+          <w:kern w:val="0"/>
+          <w:sz w:val="24"/>
+          <w:szCs w:val="24"/>
+          <w:lang w:val="en-US" w:eastAsia="zh-CN"/>
+          <w14:textFill>
+            <w14:solidFill>
+              <w14:schemeClr w14:val="tx1"/>
+            </w14:solidFill>
+          </w14:textFill>
+        </w:rPr>
+        <w:t>※※※TCP协议的特点</w:t>
+      </w:r>
+    </w:p>
+    <w:p>
+      <w:pPr>
+        <w:pStyle w:val="6"/>
+        <w:widowControl/>
+        <w:numPr>
+          <w:ilvl w:val="0"/>
+          <w:numId w:val="0"/>
+        </w:numPr>
+        <w:shd w:val="clear" w:color="auto" w:fill="FFFFFF"/>
+        <w:ind w:left="420" w:leftChars="0" w:right="-58" w:rightChars="0" w:firstLine="420" w:firstLineChars="0"/>
+        <w:rPr>
+          <w:rFonts w:hint="eastAsia" w:ascii="inherit" w:hAnsi="inherit" w:eastAsia="宋体" w:cs="Helvetica"/>
+          <w:b w:val="0"/>
+          <w:bCs w:val="0"/>
+          <w:color w:val="0000FF"/>
+          <w:kern w:val="0"/>
+          <w:sz w:val="24"/>
+          <w:szCs w:val="24"/>
+          <w:lang w:val="en-US" w:eastAsia="zh-CN"/>
+        </w:rPr>
+      </w:pPr>
+      <w:r>
+        <w:rPr>
+          <w:rFonts w:hint="eastAsia" w:ascii="inherit" w:hAnsi="inherit" w:eastAsia="宋体" w:cs="Helvetica"/>
+          <w:b w:val="0"/>
+          <w:bCs w:val="0"/>
+          <w:color w:val="0000FF"/>
+          <w:kern w:val="0"/>
+          <w:sz w:val="24"/>
+          <w:szCs w:val="24"/>
+          <w:lang w:val="en-US" w:eastAsia="zh-CN"/>
+        </w:rPr>
+        <w:t>用于在网络上提供</w:t>
+      </w:r>
+      <w:r>
+        <w:rPr>
+          <w:rFonts w:hint="eastAsia" w:ascii="inherit" w:hAnsi="inherit" w:eastAsia="宋体" w:cs="Helvetica"/>
+          <w:b/>
+          <w:bCs/>
+          <w:color w:val="0000FF"/>
+          <w:kern w:val="0"/>
+          <w:sz w:val="24"/>
+          <w:szCs w:val="24"/>
+          <w:lang w:val="en-US" w:eastAsia="zh-CN"/>
+        </w:rPr>
+        <w:t>可靠的面向连接</w:t>
+      </w:r>
+      <w:r>
+        <w:rPr>
+          <w:rFonts w:hint="eastAsia" w:ascii="inherit" w:hAnsi="inherit" w:eastAsia="宋体" w:cs="Helvetica"/>
+          <w:b w:val="0"/>
+          <w:bCs w:val="0"/>
+          <w:color w:val="0000FF"/>
+          <w:kern w:val="0"/>
+          <w:sz w:val="24"/>
+          <w:szCs w:val="24"/>
+          <w:lang w:val="en-US" w:eastAsia="zh-CN"/>
+        </w:rPr>
+        <w:t>的数据传输服务，保证了传输的数据</w:t>
+      </w:r>
+      <w:r>
+        <w:rPr>
+          <w:rFonts w:hint="eastAsia" w:ascii="inherit" w:hAnsi="inherit" w:eastAsia="宋体" w:cs="Helvetica"/>
+          <w:b/>
+          <w:bCs/>
+          <w:color w:val="0000FF"/>
+          <w:kern w:val="0"/>
+          <w:sz w:val="24"/>
+          <w:szCs w:val="24"/>
+          <w:lang w:val="en-US" w:eastAsia="zh-CN"/>
+        </w:rPr>
+        <w:t>无差错、不重复且有序发送</w:t>
+      </w:r>
+    </w:p>
+    <w:p>
+      <w:pPr>
+        <w:pStyle w:val="6"/>
+        <w:widowControl/>
+        <w:numPr>
+          <w:ilvl w:val="0"/>
+          <w:numId w:val="0"/>
+        </w:numPr>
+        <w:shd w:val="clear" w:color="auto" w:fill="FFFFFF"/>
+        <w:ind w:left="420" w:leftChars="0" w:right="-58" w:rightChars="0" w:firstLine="420" w:firstLineChars="0"/>
+        <w:rPr>
+          <w:rFonts w:hint="eastAsia" w:ascii="inherit" w:hAnsi="inherit" w:eastAsia="宋体" w:cs="Helvetica"/>
+          <w:b w:val="0"/>
+          <w:bCs w:val="0"/>
+          <w:color w:val="0000FF"/>
+          <w:kern w:val="0"/>
+          <w:sz w:val="24"/>
+          <w:szCs w:val="24"/>
+          <w:lang w:val="en-US" w:eastAsia="zh-CN"/>
+        </w:rPr>
+      </w:pPr>
+      <w:r>
+        <w:rPr>
+          <w:rFonts w:hint="eastAsia" w:ascii="inherit" w:hAnsi="inherit" w:eastAsia="宋体" w:cs="Helvetica"/>
+          <w:b w:val="0"/>
+          <w:bCs w:val="0"/>
+          <w:color w:val="0000FF"/>
+          <w:kern w:val="0"/>
+          <w:sz w:val="24"/>
+          <w:szCs w:val="24"/>
+          <w:lang w:val="en-US" w:eastAsia="zh-CN"/>
+        </w:rPr>
+        <w:t>每条TCP连接</w:t>
+      </w:r>
+      <w:r>
+        <w:rPr>
+          <w:rFonts w:hint="eastAsia" w:ascii="inherit" w:hAnsi="inherit" w:eastAsia="宋体" w:cs="Helvetica"/>
+          <w:b/>
+          <w:bCs/>
+          <w:color w:val="0000FF"/>
+          <w:kern w:val="0"/>
+          <w:sz w:val="24"/>
+          <w:szCs w:val="24"/>
+          <w:lang w:val="en-US" w:eastAsia="zh-CN"/>
+        </w:rPr>
+        <w:t>只能有两个端点</w:t>
+      </w:r>
+      <w:r>
+        <w:rPr>
+          <w:rFonts w:hint="eastAsia" w:ascii="inherit" w:hAnsi="inherit" w:eastAsia="宋体" w:cs="Helvetica"/>
+          <w:b w:val="0"/>
+          <w:bCs w:val="0"/>
+          <w:color w:val="0000FF"/>
+          <w:kern w:val="0"/>
+          <w:sz w:val="24"/>
+          <w:szCs w:val="24"/>
+          <w:lang w:val="en-US" w:eastAsia="zh-CN"/>
+        </w:rPr>
+        <w:t>，每条TCP连接都是</w:t>
+      </w:r>
+      <w:r>
+        <w:rPr>
+          <w:rFonts w:hint="eastAsia" w:ascii="inherit" w:hAnsi="inherit" w:eastAsia="宋体" w:cs="Helvetica"/>
+          <w:b/>
+          <w:bCs/>
+          <w:color w:val="0000FF"/>
+          <w:kern w:val="0"/>
+          <w:sz w:val="24"/>
+          <w:szCs w:val="24"/>
+          <w:lang w:val="en-US" w:eastAsia="zh-CN"/>
+        </w:rPr>
+        <w:t>点对点</w:t>
+      </w:r>
+      <w:r>
+        <w:rPr>
+          <w:rFonts w:hint="eastAsia" w:ascii="inherit" w:hAnsi="inherit" w:eastAsia="宋体" w:cs="Helvetica"/>
+          <w:b w:val="0"/>
+          <w:bCs w:val="0"/>
+          <w:color w:val="0000FF"/>
+          <w:kern w:val="0"/>
+          <w:sz w:val="24"/>
+          <w:szCs w:val="24"/>
+          <w:lang w:val="en-US" w:eastAsia="zh-CN"/>
+        </w:rPr>
+        <w:t>的</w:t>
+      </w:r>
+    </w:p>
+    <w:p>
+      <w:pPr>
+        <w:pStyle w:val="6"/>
+        <w:widowControl/>
+        <w:numPr>
+          <w:ilvl w:val="0"/>
+          <w:numId w:val="0"/>
+        </w:numPr>
+        <w:shd w:val="clear" w:color="auto" w:fill="FFFFFF"/>
+        <w:ind w:left="420" w:leftChars="0" w:right="-58" w:rightChars="0" w:firstLine="420" w:firstLineChars="0"/>
+        <w:rPr>
+          <w:rFonts w:hint="eastAsia" w:ascii="inherit" w:hAnsi="inherit" w:eastAsia="宋体" w:cs="Helvetica"/>
+          <w:b/>
+          <w:bCs/>
+          <w:color w:val="0000FF"/>
+          <w:kern w:val="0"/>
+          <w:sz w:val="24"/>
+          <w:szCs w:val="24"/>
+          <w:lang w:val="en-US" w:eastAsia="zh-CN"/>
+        </w:rPr>
+      </w:pPr>
+      <w:r>
+        <w:rPr>
+          <w:rFonts w:hint="eastAsia" w:ascii="inherit" w:hAnsi="inherit" w:eastAsia="宋体" w:cs="Helvetica"/>
+          <w:b w:val="0"/>
+          <w:bCs w:val="0"/>
+          <w:color w:val="0000FF"/>
+          <w:kern w:val="0"/>
+          <w:sz w:val="24"/>
+          <w:szCs w:val="24"/>
+          <w:lang w:val="en-US" w:eastAsia="zh-CN"/>
+        </w:rPr>
+        <w:t>TCP协议提供</w:t>
+      </w:r>
+      <w:r>
+        <w:rPr>
+          <w:rFonts w:hint="eastAsia" w:ascii="inherit" w:hAnsi="inherit" w:eastAsia="宋体" w:cs="Helvetica"/>
+          <w:b/>
+          <w:bCs/>
+          <w:color w:val="0000FF"/>
+          <w:kern w:val="0"/>
+          <w:sz w:val="24"/>
+          <w:szCs w:val="24"/>
+          <w:lang w:val="en-US" w:eastAsia="zh-CN"/>
+        </w:rPr>
+        <w:t>全双工通信</w:t>
+      </w:r>
+    </w:p>
+    <w:p>
+      <w:pPr>
+        <w:pStyle w:val="6"/>
+        <w:widowControl/>
+        <w:numPr>
+          <w:ilvl w:val="0"/>
+          <w:numId w:val="0"/>
+        </w:numPr>
+        <w:shd w:val="clear" w:color="auto" w:fill="FFFFFF"/>
+        <w:ind w:left="420" w:leftChars="0" w:right="-58" w:rightChars="0" w:firstLine="420" w:firstLineChars="0"/>
+        <w:rPr>
+          <w:rFonts w:hint="default" w:ascii="inherit" w:hAnsi="inherit" w:eastAsia="宋体" w:cs="Helvetica"/>
+          <w:b/>
+          <w:bCs/>
+          <w:color w:val="0000FF"/>
+          <w:kern w:val="0"/>
+          <w:sz w:val="24"/>
+          <w:szCs w:val="24"/>
+          <w:lang w:val="en-US" w:eastAsia="zh-CN"/>
+        </w:rPr>
+      </w:pPr>
+      <w:r>
+        <w:rPr>
+          <w:rFonts w:hint="eastAsia" w:ascii="inherit" w:hAnsi="inherit" w:eastAsia="宋体" w:cs="Helvetica"/>
+          <w:b w:val="0"/>
+          <w:bCs w:val="0"/>
+          <w:color w:val="0000FF"/>
+          <w:kern w:val="0"/>
+          <w:sz w:val="24"/>
+          <w:szCs w:val="24"/>
+          <w:lang w:val="en-US" w:eastAsia="zh-CN"/>
+        </w:rPr>
+        <w:t>TCP是</w:t>
+      </w:r>
+      <w:r>
+        <w:rPr>
+          <w:rFonts w:hint="eastAsia" w:ascii="inherit" w:hAnsi="inherit" w:eastAsia="宋体" w:cs="Helvetica"/>
+          <w:b/>
+          <w:bCs/>
+          <w:color w:val="0000FF"/>
+          <w:kern w:val="0"/>
+          <w:sz w:val="24"/>
+          <w:szCs w:val="24"/>
+          <w:lang w:val="en-US" w:eastAsia="zh-CN"/>
+        </w:rPr>
+        <w:t>面向连接的传输层协议</w:t>
+      </w:r>
+    </w:p>
+    <w:p>
+      <w:pPr>
+        <w:pStyle w:val="6"/>
+        <w:widowControl/>
+        <w:numPr>
+          <w:ilvl w:val="0"/>
+          <w:numId w:val="0"/>
+        </w:numPr>
+        <w:shd w:val="clear" w:color="auto" w:fill="FFFFFF"/>
+        <w:ind w:left="420" w:leftChars="0" w:right="-58" w:rightChars="0" w:firstLine="420" w:firstLineChars="0"/>
+        <w:rPr>
+          <w:rFonts w:hint="eastAsia" w:ascii="inherit" w:hAnsi="inherit" w:eastAsia="宋体" w:cs="Helvetica"/>
+          <w:b/>
+          <w:bCs/>
+          <w:color w:val="0000FF"/>
+          <w:kern w:val="0"/>
+          <w:sz w:val="24"/>
+          <w:szCs w:val="24"/>
+          <w:lang w:val="en-US" w:eastAsia="zh-CN"/>
+        </w:rPr>
+      </w:pPr>
+      <w:r>
+        <w:rPr>
+          <w:rFonts w:hint="eastAsia" w:ascii="inherit" w:hAnsi="inherit" w:eastAsia="宋体" w:cs="Helvetica"/>
+          <w:b w:val="0"/>
+          <w:bCs w:val="0"/>
+          <w:color w:val="0000FF"/>
+          <w:kern w:val="0"/>
+          <w:sz w:val="24"/>
+          <w:szCs w:val="24"/>
+          <w:lang w:val="en-US" w:eastAsia="zh-CN"/>
+        </w:rPr>
+        <w:t>TCP协议面向</w:t>
+      </w:r>
+      <w:r>
+        <w:rPr>
+          <w:rFonts w:hint="eastAsia" w:ascii="inherit" w:hAnsi="inherit" w:eastAsia="宋体" w:cs="Helvetica"/>
+          <w:b/>
+          <w:bCs/>
+          <w:color w:val="0000FF"/>
+          <w:kern w:val="0"/>
+          <w:sz w:val="24"/>
+          <w:szCs w:val="24"/>
+          <w:lang w:val="en-US" w:eastAsia="zh-CN"/>
+        </w:rPr>
+        <w:t>字节流</w:t>
+      </w:r>
+    </w:p>
+    <w:p>
+      <w:pPr>
+        <w:pStyle w:val="6"/>
+        <w:widowControl/>
+        <w:numPr>
+          <w:ilvl w:val="0"/>
+          <w:numId w:val="0"/>
+        </w:numPr>
+        <w:shd w:val="clear" w:color="auto" w:fill="FFFFFF"/>
+        <w:ind w:left="420" w:leftChars="0" w:right="-58" w:rightChars="0" w:firstLine="420" w:firstLineChars="0"/>
+        <w:rPr>
+          <w:rFonts w:hint="eastAsia" w:ascii="inherit" w:hAnsi="inherit" w:eastAsia="宋体" w:cs="Helvetica"/>
+          <w:b/>
+          <w:bCs/>
+          <w:color w:val="0000FF"/>
+          <w:kern w:val="0"/>
+          <w:sz w:val="24"/>
+          <w:szCs w:val="24"/>
+          <w:lang w:val="en-US" w:eastAsia="zh-CN"/>
+        </w:rPr>
+      </w:pPr>
+    </w:p>
+    <w:p>
+      <w:pPr>
+        <w:pStyle w:val="6"/>
+        <w:widowControl/>
+        <w:numPr>
+          <w:ilvl w:val="0"/>
+          <w:numId w:val="1"/>
+        </w:numPr>
+        <w:shd w:val="clear" w:color="auto" w:fill="FFFFFF"/>
+        <w:ind w:right="-58" w:firstLineChars="0"/>
+        <w:rPr>
+          <w:rFonts w:hint="default" w:ascii="inherit" w:hAnsi="inherit" w:eastAsia="宋体" w:cs="Helvetica"/>
+          <w:b/>
+          <w:bCs/>
+          <w:color w:val="000000" w:themeColor="text1"/>
+          <w:kern w:val="0"/>
+          <w:sz w:val="24"/>
+          <w:szCs w:val="24"/>
+          <w:lang w:val="en-US" w:eastAsia="zh-CN"/>
+          <w14:textFill>
+            <w14:solidFill>
+              <w14:schemeClr w14:val="tx1"/>
+            </w14:solidFill>
+          </w14:textFill>
+        </w:rPr>
+      </w:pPr>
+      <w:r>
+        <w:rPr>
+          <w:rFonts w:hint="eastAsia" w:ascii="inherit" w:hAnsi="inherit" w:eastAsia="宋体" w:cs="Helvetica"/>
+          <w:b/>
+          <w:bCs/>
+          <w:color w:val="000000" w:themeColor="text1"/>
+          <w:kern w:val="0"/>
+          <w:sz w:val="24"/>
+          <w:szCs w:val="24"/>
+          <w:lang w:val="en-US" w:eastAsia="zh-CN"/>
+          <w14:textFill>
+            <w14:solidFill>
+              <w14:schemeClr w14:val="tx1"/>
+            </w14:solidFill>
+          </w14:textFill>
+        </w:rPr>
+        <w:t>※※※在通信子网中，中间节点常用</w:t>
+      </w:r>
+      <w:r>
+        <w:rPr>
+          <w:rFonts w:hint="eastAsia" w:ascii="inherit" w:hAnsi="inherit" w:eastAsia="宋体" w:cs="Helvetica"/>
+          <w:b/>
+          <w:bCs/>
+          <w:color w:val="0000FF"/>
+          <w:kern w:val="0"/>
+          <w:sz w:val="24"/>
+          <w:szCs w:val="24"/>
+          <w:lang w:val="en-US" w:eastAsia="zh-CN"/>
+        </w:rPr>
+        <w:t>超时重传包的数量、平均包延迟以及包延迟变化</w:t>
+      </w:r>
+      <w:r>
+        <w:rPr>
+          <w:rFonts w:hint="eastAsia" w:ascii="inherit" w:hAnsi="inherit" w:eastAsia="宋体" w:cs="Helvetica"/>
+          <w:b/>
+          <w:bCs/>
+          <w:color w:val="000000" w:themeColor="text1"/>
+          <w:kern w:val="0"/>
+          <w:sz w:val="24"/>
+          <w:szCs w:val="24"/>
+          <w:lang w:val="en-US" w:eastAsia="zh-CN"/>
+          <w14:textFill>
+            <w14:solidFill>
+              <w14:schemeClr w14:val="tx1"/>
+            </w14:solidFill>
+          </w14:textFill>
+        </w:rPr>
+        <w:t>等参数来判断拥塞的产生</w:t>
+      </w:r>
+    </w:p>
+    <w:p>
+      <w:pPr>
+        <w:pStyle w:val="6"/>
+        <w:widowControl/>
+        <w:numPr>
+          <w:ilvl w:val="0"/>
+          <w:numId w:val="0"/>
+        </w:numPr>
+        <w:shd w:val="clear" w:color="auto" w:fill="FFFFFF"/>
+        <w:ind w:right="-58" w:rightChars="0"/>
+        <w:rPr>
+          <w:rFonts w:hint="default" w:ascii="inherit" w:hAnsi="inherit" w:eastAsia="宋体" w:cs="Helvetica"/>
+          <w:b/>
+          <w:bCs/>
+          <w:color w:val="0000FF"/>
+          <w:kern w:val="0"/>
+          <w:sz w:val="24"/>
+          <w:szCs w:val="24"/>
+          <w:lang w:val="en-US" w:eastAsia="zh-CN"/>
+        </w:rPr>
+      </w:pPr>
+    </w:p>
+    <w:p>
+      <w:pPr>
+        <w:pStyle w:val="6"/>
+        <w:widowControl/>
+        <w:numPr>
+          <w:ilvl w:val="0"/>
+          <w:numId w:val="1"/>
+        </w:numPr>
+        <w:shd w:val="clear" w:color="auto" w:fill="FFFFFF"/>
+        <w:ind w:right="-58" w:firstLineChars="0"/>
+        <w:rPr>
+          <w:rFonts w:hint="default" w:ascii="inherit" w:hAnsi="inherit" w:eastAsia="宋体" w:cs="Helvetica"/>
+          <w:b/>
+          <w:bCs/>
+          <w:color w:val="000000" w:themeColor="text1"/>
+          <w:kern w:val="0"/>
+          <w:sz w:val="24"/>
+          <w:szCs w:val="24"/>
+          <w:lang w:val="en-US" w:eastAsia="zh-CN"/>
+          <w14:textFill>
+            <w14:solidFill>
+              <w14:schemeClr w14:val="tx1"/>
+            </w14:solidFill>
+          </w14:textFill>
+        </w:rPr>
+      </w:pPr>
+      <w:r>
+        <w:rPr>
+          <w:rFonts w:hint="eastAsia" w:ascii="inherit" w:hAnsi="inherit" w:eastAsia="宋体" w:cs="Helvetica"/>
+          <w:b/>
+          <w:bCs/>
+          <w:color w:val="000000" w:themeColor="text1"/>
+          <w:kern w:val="0"/>
+          <w:sz w:val="24"/>
+          <w:szCs w:val="24"/>
+          <w:lang w:val="en-US" w:eastAsia="zh-CN"/>
+          <w14:textFill>
+            <w14:solidFill>
+              <w14:schemeClr w14:val="tx1"/>
+            </w14:solidFill>
+          </w14:textFill>
+        </w:rPr>
+        <w:t>TCP/IP体系结构的传输层包括面向连接的TCP协议以及无连接的UDP协议</w:t>
+      </w:r>
+      <w:bookmarkStart w:id="1" w:name="_GoBack"/>
+      <w:bookmarkEnd w:id="1"/>
+    </w:p>
+    <w:p>
+      <w:pPr>
+        <w:pStyle w:val="6"/>
+        <w:widowControl/>
+        <w:numPr>
+          <w:ilvl w:val="0"/>
+          <w:numId w:val="0"/>
+        </w:numPr>
+        <w:shd w:val="clear" w:color="auto" w:fill="FFFFFF"/>
+        <w:ind w:right="-58" w:rightChars="0"/>
+        <w:rPr>
+          <w:rFonts w:hint="default" w:ascii="inherit" w:hAnsi="inherit" w:eastAsia="宋体" w:cs="Helvetica"/>
+          <w:b/>
+          <w:bCs/>
+          <w:color w:val="0000FF"/>
+          <w:kern w:val="0"/>
+          <w:sz w:val="24"/>
+          <w:szCs w:val="24"/>
+          <w:lang w:val="en-US" w:eastAsia="zh-CN"/>
         </w:rPr>
       </w:pPr>
     </w:p>
@@ -30978,12 +33815,13 @@
     </w:lvl>
   </w:abstractNum>
   <w:abstractNum w:abstractNumId="2">
-    <w:nsid w:val="65F11B91"/>
+    <w:nsid w:val="3CEA12C6"/>
     <w:multiLevelType w:val="multilevel"/>
-    <w:tmpl w:val="65F11B91"/>
+    <w:tmpl w:val="3CEA12C6"/>
     <w:lvl w:ilvl="0" w:tentative="0">
       <w:start w:val="1"/>
       <w:numFmt w:val="decimal"/>
+      <w:suff w:val="space"/>
       <w:lvlText w:val="%1."/>
       <w:lvlJc w:val="left"/>
       <w:pPr>

</xml_diff>